<commit_message>
modified:   harassment/paper-revisions/Cover Letter_PeerJ.docx 	modified:   harassment/paper-revisions/Table.docx 	modified:   harassment/paper-revisions/Title page with Declarations.docx 	modified:   harassment/paper-revisions/Manuscript_PeerJ.docx
</commit_message>
<xml_diff>
--- a/harassment/paper-revisions/Table.docx
+++ b/harassment/paper-revisions/Table.docx
@@ -1,6 +1,6 @@
 
 <file path=word/document.xml><?xml version="1.0" encoding="utf-8"?>
-<w:document xmlns:mc="http://schemas.openxmlformats.org/markup-compatibility/2006" xmlns:r="http://schemas.openxmlformats.org/officeDocument/2006/relationships" xmlns:w="http://schemas.openxmlformats.org/wordprocessingml/2006/main" xmlns:w14="http://schemas.microsoft.com/office/word/2010/wordml" mc:Ignorable="w14 w15 w16se w16cid w16 w16cex w16sdtdh w16sdtfl w16du wp14">
+<w:document xmlns:wpc="http://schemas.microsoft.com/office/word/2010/wordprocessingCanvas" xmlns:cx="http://schemas.microsoft.com/office/drawing/2014/chartex" xmlns:cx1="http://schemas.microsoft.com/office/drawing/2015/9/8/chartex" xmlns:cx2="http://schemas.microsoft.com/office/drawing/2015/10/21/chartex" xmlns:cx3="http://schemas.microsoft.com/office/drawing/2016/5/9/chartex" xmlns:cx4="http://schemas.microsoft.com/office/drawing/2016/5/10/chartex" xmlns:cx5="http://schemas.microsoft.com/office/drawing/2016/5/11/chartex" xmlns:cx6="http://schemas.microsoft.com/office/drawing/2016/5/12/chartex" xmlns:cx7="http://schemas.microsoft.com/office/drawing/2016/5/13/chartex" xmlns:cx8="http://schemas.microsoft.com/office/drawing/2016/5/14/chartex" xmlns:mc="http://schemas.openxmlformats.org/markup-compatibility/2006" xmlns:aink="http://schemas.microsoft.com/office/drawing/2016/ink" xmlns:am3d="http://schemas.microsoft.com/office/drawing/2017/model3d" xmlns:o="urn:schemas-microsoft-com:office:office" xmlns:oel="http://schemas.microsoft.com/office/2019/extlst" xmlns:r="http://schemas.openxmlformats.org/officeDocument/2006/relationships" xmlns:m="http://schemas.openxmlformats.org/officeDocument/2006/math" xmlns:v="urn:schemas-microsoft-com:vml" xmlns:wp14="http://schemas.microsoft.com/office/word/2010/wordprocessingDrawing" xmlns:wp="http://schemas.openxmlformats.org/drawingml/2006/wordprocessingDrawing" xmlns:w10="urn:schemas-microsoft-com:office:word" xmlns:w="http://schemas.openxmlformats.org/wordprocessingml/2006/main" xmlns:w14="http://schemas.microsoft.com/office/word/2010/wordml" xmlns:w15="http://schemas.microsoft.com/office/word/2012/wordml" xmlns:w16cex="http://schemas.microsoft.com/office/word/2018/wordml/cex" xmlns:w16cid="http://schemas.microsoft.com/office/word/2016/wordml/cid" xmlns:w16="http://schemas.microsoft.com/office/word/2018/wordml" xmlns:w16du="http://schemas.microsoft.com/office/word/2023/wordml/word16du" xmlns:w16sdtdh="http://schemas.microsoft.com/office/word/2020/wordml/sdtdatahash" xmlns:w16sdtfl="http://schemas.microsoft.com/office/word/2024/wordml/sdtformatlock" xmlns:w16se="http://schemas.microsoft.com/office/word/2015/wordml/symex" xmlns:wpg="http://schemas.microsoft.com/office/word/2010/wordprocessingGroup" xmlns:wpi="http://schemas.microsoft.com/office/word/2010/wordprocessingInk" xmlns:wne="http://schemas.microsoft.com/office/word/2006/wordml" xmlns:wps="http://schemas.microsoft.com/office/word/2010/wordprocessingShape" mc:Ignorable="w14 w15 w16se w16cid w16 w16cex w16sdtdh w16sdtfl w16du wp14">
   <w:background w:color="FFFFFF"/>
   <w:body>
     <w:p>
@@ -309,7 +309,6 @@
                 <w:lang w:val="en-US"/>
               </w:rPr>
             </w:pPr>
-            <w:proofErr w:type="spellStart"/>
             <w:r>
               <w:rPr>
                 <w:rFonts w:asciiTheme="majorBidi" w:eastAsiaTheme="minorEastAsia" w:hAnsiTheme="majorBidi" w:cstheme="majorBidi"/>
@@ -317,7 +316,6 @@
               </w:rPr>
               <w:t>sk</w:t>
             </w:r>
-            <w:proofErr w:type="spellEnd"/>
           </w:p>
         </w:tc>
         <w:tc>
@@ -344,7 +342,6 @@
                 <w:lang w:val="en-US"/>
               </w:rPr>
             </w:pPr>
-            <w:proofErr w:type="spellStart"/>
             <w:r>
               <w:rPr>
                 <w:rFonts w:asciiTheme="majorBidi" w:eastAsiaTheme="minorEastAsia" w:hAnsiTheme="majorBidi" w:cstheme="majorBidi"/>
@@ -352,7 +349,6 @@
               </w:rPr>
               <w:t>ku</w:t>
             </w:r>
-            <w:proofErr w:type="spellEnd"/>
           </w:p>
         </w:tc>
       </w:tr>
@@ -3588,39 +3584,7 @@
           <w:rFonts w:eastAsiaTheme="minorEastAsia"/>
           <w:bCs/>
         </w:rPr>
-        <w:t xml:space="preserve">gender was coded as 0 = male and 1 = female; thus, the mean reflects the proportion of participants coded as 1 (female). </w:t>
-      </w:r>
-      <w:proofErr w:type="spellStart"/>
-      <w:r>
-        <w:rPr>
-          <w:rFonts w:eastAsiaTheme="minorEastAsia"/>
-          <w:bCs/>
-        </w:rPr>
-        <w:t>sk</w:t>
-      </w:r>
-      <w:proofErr w:type="spellEnd"/>
-      <w:r>
-        <w:rPr>
-          <w:rFonts w:eastAsiaTheme="minorEastAsia"/>
-          <w:bCs/>
-        </w:rPr>
-        <w:t xml:space="preserve"> = skewness; </w:t>
-      </w:r>
-      <w:proofErr w:type="spellStart"/>
-      <w:r>
-        <w:rPr>
-          <w:rFonts w:eastAsiaTheme="minorEastAsia"/>
-          <w:bCs/>
-        </w:rPr>
-        <w:t>ku</w:t>
-      </w:r>
-      <w:proofErr w:type="spellEnd"/>
-      <w:r>
-        <w:rPr>
-          <w:rFonts w:eastAsiaTheme="minorEastAsia"/>
-          <w:bCs/>
-        </w:rPr>
-        <w:t xml:space="preserve"> = kurtosis.</w:t>
+        <w:t>gender was coded as 0 = male and 1 = female; thus, the mean reflects the proportion of participants coded as 1 (female). sk = skewness; ku = kurtosis.</w:t>
       </w:r>
     </w:p>
     <w:p>
@@ -8136,7 +8100,6 @@
                 <w:lang w:val="en-US"/>
               </w:rPr>
             </w:pPr>
-            <w:proofErr w:type="spellStart"/>
             <w:r>
               <w:rPr>
                 <w:rFonts w:asciiTheme="majorBidi" w:eastAsiaTheme="minorEastAsia" w:hAnsiTheme="majorBidi" w:cstheme="majorBidi"/>
@@ -8146,7 +8109,6 @@
               </w:rPr>
               <w:t>A_controls+DT</w:t>
             </w:r>
-            <w:proofErr w:type="spellEnd"/>
           </w:p>
         </w:tc>
         <w:tc>
@@ -8345,7 +8307,6 @@
                 <w:lang w:val="en-US"/>
               </w:rPr>
             </w:pPr>
-            <w:proofErr w:type="spellStart"/>
             <w:r>
               <w:rPr>
                 <w:rFonts w:asciiTheme="majorBidi" w:eastAsiaTheme="minorEastAsia" w:hAnsiTheme="majorBidi" w:cstheme="majorBidi"/>
@@ -8355,7 +8316,6 @@
               </w:rPr>
               <w:t>A_controls+DT</w:t>
             </w:r>
-            <w:proofErr w:type="spellEnd"/>
           </w:p>
         </w:tc>
         <w:tc>
@@ -8554,7 +8514,6 @@
                 <w:lang w:val="en-US"/>
               </w:rPr>
             </w:pPr>
-            <w:proofErr w:type="spellStart"/>
             <w:r>
               <w:rPr>
                 <w:rFonts w:asciiTheme="majorBidi" w:eastAsiaTheme="minorEastAsia" w:hAnsiTheme="majorBidi" w:cstheme="majorBidi"/>
@@ -8564,7 +8523,6 @@
               </w:rPr>
               <w:t>A_controls+DT</w:t>
             </w:r>
-            <w:proofErr w:type="spellEnd"/>
           </w:p>
         </w:tc>
         <w:tc>
@@ -8767,7 +8725,6 @@
                 <w:lang w:val="en-US"/>
               </w:rPr>
             </w:pPr>
-            <w:proofErr w:type="spellStart"/>
             <w:r>
               <w:rPr>
                 <w:rFonts w:asciiTheme="majorBidi" w:eastAsiaTheme="minorEastAsia" w:hAnsiTheme="majorBidi" w:cstheme="majorBidi"/>
@@ -8777,7 +8734,6 @@
               </w:rPr>
               <w:t>B_controls+DT+HEXACO</w:t>
             </w:r>
-            <w:proofErr w:type="spellEnd"/>
           </w:p>
         </w:tc>
         <w:tc>
@@ -8976,7 +8932,6 @@
                 <w:lang w:val="en-US"/>
               </w:rPr>
             </w:pPr>
-            <w:proofErr w:type="spellStart"/>
             <w:r>
               <w:rPr>
                 <w:rFonts w:asciiTheme="majorBidi" w:eastAsiaTheme="minorEastAsia" w:hAnsiTheme="majorBidi" w:cstheme="majorBidi"/>
@@ -8986,7 +8941,6 @@
               </w:rPr>
               <w:t>B_controls+DT+HEXACO</w:t>
             </w:r>
-            <w:proofErr w:type="spellEnd"/>
           </w:p>
         </w:tc>
         <w:tc>
@@ -9185,7 +9139,6 @@
                 <w:lang w:val="en-US"/>
               </w:rPr>
             </w:pPr>
-            <w:proofErr w:type="spellStart"/>
             <w:r>
               <w:rPr>
                 <w:rFonts w:asciiTheme="majorBidi" w:eastAsiaTheme="minorEastAsia" w:hAnsiTheme="majorBidi" w:cstheme="majorBidi"/>
@@ -9195,7 +9148,6 @@
               </w:rPr>
               <w:t>B_controls+DT+HEXACO</w:t>
             </w:r>
-            <w:proofErr w:type="spellEnd"/>
           </w:p>
         </w:tc>
         <w:tc>
@@ -9398,7 +9350,6 @@
                 <w:lang w:val="en-US"/>
               </w:rPr>
             </w:pPr>
-            <w:proofErr w:type="spellStart"/>
             <w:r>
               <w:rPr>
                 <w:rFonts w:asciiTheme="majorBidi" w:eastAsiaTheme="minorEastAsia" w:hAnsiTheme="majorBidi" w:cstheme="majorBidi"/>
@@ -9408,7 +9359,6 @@
               </w:rPr>
               <w:t>B_controls+DT+HEXACO</w:t>
             </w:r>
-            <w:proofErr w:type="spellEnd"/>
           </w:p>
         </w:tc>
         <w:tc>
@@ -9611,7 +9561,6 @@
                 <w:lang w:val="en-US"/>
               </w:rPr>
             </w:pPr>
-            <w:proofErr w:type="spellStart"/>
             <w:r>
               <w:rPr>
                 <w:rFonts w:asciiTheme="majorBidi" w:eastAsiaTheme="minorEastAsia" w:hAnsiTheme="majorBidi" w:cstheme="majorBidi"/>
@@ -9621,7 +9570,6 @@
               </w:rPr>
               <w:t>B_controls+DT+HEXACO</w:t>
             </w:r>
-            <w:proofErr w:type="spellEnd"/>
           </w:p>
         </w:tc>
         <w:tc>
@@ -9820,7 +9768,6 @@
                 <w:lang w:val="en-US"/>
               </w:rPr>
             </w:pPr>
-            <w:proofErr w:type="spellStart"/>
             <w:r>
               <w:rPr>
                 <w:rFonts w:asciiTheme="majorBidi" w:eastAsiaTheme="minorEastAsia" w:hAnsiTheme="majorBidi" w:cstheme="majorBidi"/>
@@ -9830,7 +9777,6 @@
               </w:rPr>
               <w:t>B_controls+DT+HEXACO</w:t>
             </w:r>
-            <w:proofErr w:type="spellEnd"/>
           </w:p>
         </w:tc>
         <w:tc>
@@ -10029,7 +9975,6 @@
                 <w:lang w:val="en-US"/>
               </w:rPr>
             </w:pPr>
-            <w:proofErr w:type="spellStart"/>
             <w:r>
               <w:rPr>
                 <w:rFonts w:asciiTheme="majorBidi" w:eastAsiaTheme="minorEastAsia" w:hAnsiTheme="majorBidi" w:cstheme="majorBidi"/>
@@ -10039,7 +9984,6 @@
               </w:rPr>
               <w:t>B_controls+DT+HEXACO</w:t>
             </w:r>
-            <w:proofErr w:type="spellEnd"/>
           </w:p>
         </w:tc>
         <w:tc>
@@ -10238,7 +10182,6 @@
                 <w:lang w:val="en-US"/>
               </w:rPr>
             </w:pPr>
-            <w:proofErr w:type="spellStart"/>
             <w:r>
               <w:rPr>
                 <w:rFonts w:asciiTheme="majorBidi" w:eastAsiaTheme="minorEastAsia" w:hAnsiTheme="majorBidi" w:cstheme="majorBidi"/>
@@ -10248,7 +10191,6 @@
               </w:rPr>
               <w:t>B_controls+DT+HEXACO</w:t>
             </w:r>
-            <w:proofErr w:type="spellEnd"/>
           </w:p>
         </w:tc>
         <w:tc>
@@ -10447,7 +10389,6 @@
                 <w:lang w:val="en-US"/>
               </w:rPr>
             </w:pPr>
-            <w:proofErr w:type="spellStart"/>
             <w:r>
               <w:rPr>
                 <w:rFonts w:asciiTheme="majorBidi" w:eastAsiaTheme="minorEastAsia" w:hAnsiTheme="majorBidi" w:cstheme="majorBidi"/>
@@ -10457,7 +10398,6 @@
               </w:rPr>
               <w:t>B_controls+DT+HEXACO</w:t>
             </w:r>
-            <w:proofErr w:type="spellEnd"/>
           </w:p>
         </w:tc>
         <w:tc>
@@ -10656,45 +10596,14 @@
                 <w:lang w:val="en-US"/>
               </w:rPr>
             </w:pPr>
-            <w:proofErr w:type="spellStart"/>
-            <w:r>
-              <w:rPr>
-                <w:rFonts w:asciiTheme="majorBidi" w:eastAsiaTheme="minorEastAsia" w:hAnsiTheme="majorBidi" w:cstheme="majorBidi"/>
-                <w:sz w:val="21"/>
-                <w:szCs w:val="21"/>
-                <w:lang w:val="en-US"/>
-              </w:rPr>
-              <w:t>B_sensitivity</w:t>
-            </w:r>
-            <w:proofErr w:type="spellEnd"/>
-            <w:r>
-              <w:rPr>
-                <w:rFonts w:asciiTheme="majorBidi" w:eastAsiaTheme="minorEastAsia" w:hAnsiTheme="majorBidi" w:cstheme="majorBidi"/>
-                <w:sz w:val="21"/>
-                <w:szCs w:val="21"/>
-                <w:lang w:val="en-US"/>
-              </w:rPr>
-              <w:t>_(</w:t>
-            </w:r>
-            <w:proofErr w:type="spellStart"/>
-            <w:r>
-              <w:rPr>
-                <w:rFonts w:asciiTheme="majorBidi" w:eastAsiaTheme="minorEastAsia" w:hAnsiTheme="majorBidi" w:cstheme="majorBidi"/>
-                <w:sz w:val="21"/>
-                <w:szCs w:val="21"/>
-                <w:lang w:val="en-US"/>
-              </w:rPr>
-              <w:t>drop_high_Cooks</w:t>
-            </w:r>
-            <w:proofErr w:type="spellEnd"/>
-            <w:r>
-              <w:rPr>
-                <w:rFonts w:asciiTheme="majorBidi" w:eastAsiaTheme="minorEastAsia" w:hAnsiTheme="majorBidi" w:cstheme="majorBidi"/>
-                <w:sz w:val="21"/>
-                <w:szCs w:val="21"/>
-                <w:lang w:val="en-US"/>
-              </w:rPr>
-              <w:t>)</w:t>
+            <w:r>
+              <w:rPr>
+                <w:rFonts w:asciiTheme="majorBidi" w:eastAsiaTheme="minorEastAsia" w:hAnsiTheme="majorBidi" w:cstheme="majorBidi"/>
+                <w:sz w:val="21"/>
+                <w:szCs w:val="21"/>
+                <w:lang w:val="en-US"/>
+              </w:rPr>
+              <w:t>B_sensitivity_(drop_high_Cooks)</w:t>
             </w:r>
           </w:p>
         </w:tc>
@@ -10894,45 +10803,14 @@
                 <w:lang w:val="en-US"/>
               </w:rPr>
             </w:pPr>
-            <w:proofErr w:type="spellStart"/>
-            <w:r>
-              <w:rPr>
-                <w:rFonts w:asciiTheme="majorBidi" w:eastAsiaTheme="minorEastAsia" w:hAnsiTheme="majorBidi" w:cstheme="majorBidi"/>
-                <w:sz w:val="21"/>
-                <w:szCs w:val="21"/>
-                <w:lang w:val="en-US"/>
-              </w:rPr>
-              <w:t>B_sensitivity</w:t>
-            </w:r>
-            <w:proofErr w:type="spellEnd"/>
-            <w:r>
-              <w:rPr>
-                <w:rFonts w:asciiTheme="majorBidi" w:eastAsiaTheme="minorEastAsia" w:hAnsiTheme="majorBidi" w:cstheme="majorBidi"/>
-                <w:sz w:val="21"/>
-                <w:szCs w:val="21"/>
-                <w:lang w:val="en-US"/>
-              </w:rPr>
-              <w:t>_(</w:t>
-            </w:r>
-            <w:proofErr w:type="spellStart"/>
-            <w:r>
-              <w:rPr>
-                <w:rFonts w:asciiTheme="majorBidi" w:eastAsiaTheme="minorEastAsia" w:hAnsiTheme="majorBidi" w:cstheme="majorBidi"/>
-                <w:sz w:val="21"/>
-                <w:szCs w:val="21"/>
-                <w:lang w:val="en-US"/>
-              </w:rPr>
-              <w:t>drop_high_Cooks</w:t>
-            </w:r>
-            <w:proofErr w:type="spellEnd"/>
-            <w:r>
-              <w:rPr>
-                <w:rFonts w:asciiTheme="majorBidi" w:eastAsiaTheme="minorEastAsia" w:hAnsiTheme="majorBidi" w:cstheme="majorBidi"/>
-                <w:sz w:val="21"/>
-                <w:szCs w:val="21"/>
-                <w:lang w:val="en-US"/>
-              </w:rPr>
-              <w:t>)</w:t>
+            <w:r>
+              <w:rPr>
+                <w:rFonts w:asciiTheme="majorBidi" w:eastAsiaTheme="minorEastAsia" w:hAnsiTheme="majorBidi" w:cstheme="majorBidi"/>
+                <w:sz w:val="21"/>
+                <w:szCs w:val="21"/>
+                <w:lang w:val="en-US"/>
+              </w:rPr>
+              <w:t>B_sensitivity_(drop_high_Cooks)</w:t>
             </w:r>
           </w:p>
         </w:tc>
@@ -11138,45 +11016,14 @@
                 <w:lang w:val="en-US"/>
               </w:rPr>
             </w:pPr>
-            <w:proofErr w:type="spellStart"/>
-            <w:r>
-              <w:rPr>
-                <w:rFonts w:asciiTheme="majorBidi" w:eastAsiaTheme="minorEastAsia" w:hAnsiTheme="majorBidi" w:cstheme="majorBidi"/>
-                <w:sz w:val="21"/>
-                <w:szCs w:val="21"/>
-                <w:lang w:val="en-US"/>
-              </w:rPr>
-              <w:t>B_sensitivity</w:t>
-            </w:r>
-            <w:proofErr w:type="spellEnd"/>
-            <w:r>
-              <w:rPr>
-                <w:rFonts w:asciiTheme="majorBidi" w:eastAsiaTheme="minorEastAsia" w:hAnsiTheme="majorBidi" w:cstheme="majorBidi"/>
-                <w:sz w:val="21"/>
-                <w:szCs w:val="21"/>
-                <w:lang w:val="en-US"/>
-              </w:rPr>
-              <w:t>_(</w:t>
-            </w:r>
-            <w:proofErr w:type="spellStart"/>
-            <w:r>
-              <w:rPr>
-                <w:rFonts w:asciiTheme="majorBidi" w:eastAsiaTheme="minorEastAsia" w:hAnsiTheme="majorBidi" w:cstheme="majorBidi"/>
-                <w:sz w:val="21"/>
-                <w:szCs w:val="21"/>
-                <w:lang w:val="en-US"/>
-              </w:rPr>
-              <w:t>drop_high_Cooks</w:t>
-            </w:r>
-            <w:proofErr w:type="spellEnd"/>
-            <w:r>
-              <w:rPr>
-                <w:rFonts w:asciiTheme="majorBidi" w:eastAsiaTheme="minorEastAsia" w:hAnsiTheme="majorBidi" w:cstheme="majorBidi"/>
-                <w:sz w:val="21"/>
-                <w:szCs w:val="21"/>
-                <w:lang w:val="en-US"/>
-              </w:rPr>
-              <w:t>)</w:t>
+            <w:r>
+              <w:rPr>
+                <w:rFonts w:asciiTheme="majorBidi" w:eastAsiaTheme="minorEastAsia" w:hAnsiTheme="majorBidi" w:cstheme="majorBidi"/>
+                <w:sz w:val="21"/>
+                <w:szCs w:val="21"/>
+                <w:lang w:val="en-US"/>
+              </w:rPr>
+              <w:t>B_sensitivity_(drop_high_Cooks)</w:t>
             </w:r>
           </w:p>
         </w:tc>
@@ -11367,47 +11214,7 @@
                 <w:szCs w:val="21"/>
                 <w:lang w:val="en-US"/>
               </w:rPr>
-              <w:t xml:space="preserve">Model B = controls (age, gender, region) + Dark Triad (M, N, P) + HEXACO (H–H, E, X, A, C, O). Internal labels: </w:t>
-            </w:r>
-            <w:proofErr w:type="spellStart"/>
-            <w:r>
-              <w:rPr>
-                <w:rFonts w:asciiTheme="majorBidi" w:eastAsiaTheme="minorEastAsia" w:hAnsiTheme="majorBidi" w:cstheme="majorBidi"/>
-                <w:sz w:val="21"/>
-                <w:szCs w:val="21"/>
-                <w:lang w:val="en-US"/>
-              </w:rPr>
-              <w:t>B_controls+DT+HEXACO</w:t>
-            </w:r>
-            <w:proofErr w:type="spellEnd"/>
-            <w:r>
-              <w:rPr>
-                <w:rFonts w:asciiTheme="majorBidi" w:eastAsiaTheme="minorEastAsia" w:hAnsiTheme="majorBidi" w:cstheme="majorBidi"/>
-                <w:sz w:val="21"/>
-                <w:szCs w:val="21"/>
-                <w:lang w:val="en-US"/>
-              </w:rPr>
-              <w:t xml:space="preserve"> = Model B (overall); </w:t>
-            </w:r>
-            <w:proofErr w:type="spellStart"/>
-            <w:r>
-              <w:rPr>
-                <w:rFonts w:asciiTheme="majorBidi" w:eastAsiaTheme="minorEastAsia" w:hAnsiTheme="majorBidi" w:cstheme="majorBidi"/>
-                <w:sz w:val="21"/>
-                <w:szCs w:val="21"/>
-                <w:lang w:val="en-US"/>
-              </w:rPr>
-              <w:t>B_by_gender</w:t>
-            </w:r>
-            <w:proofErr w:type="spellEnd"/>
-            <w:r>
-              <w:rPr>
-                <w:rFonts w:asciiTheme="majorBidi" w:eastAsiaTheme="minorEastAsia" w:hAnsiTheme="majorBidi" w:cstheme="majorBidi"/>
-                <w:sz w:val="21"/>
-                <w:szCs w:val="21"/>
-                <w:lang w:val="en-US"/>
-              </w:rPr>
-              <w:t xml:space="preserve"> = Model B estimated separately by gender. Standardized β; HC3 robust SE; two-tailed tests; *** </w:t>
+              <w:t xml:space="preserve">Model B = controls (age, gender, region) + Dark Triad (M, N, P) + HEXACO (H–H, E, X, A, C, O). Internal labels: B_controls+DT+HEXACO = Model B (overall); B_by_gender = Model B estimated separately by gender. Standardized β; HC3 robust SE; two-tailed tests; *** </w:t>
             </w:r>
             <w:r>
               <w:rPr>
@@ -11783,45 +11590,14 @@
                 <w:lang w:val="en-US"/>
               </w:rPr>
             </w:pPr>
-            <w:proofErr w:type="spellStart"/>
-            <w:r>
-              <w:rPr>
-                <w:rFonts w:asciiTheme="majorBidi" w:eastAsiaTheme="minorEastAsia" w:hAnsiTheme="majorBidi" w:cstheme="majorBidi"/>
-                <w:sz w:val="21"/>
-                <w:szCs w:val="21"/>
-                <w:lang w:val="en-US"/>
-              </w:rPr>
-              <w:t>B_sensitivity</w:t>
-            </w:r>
-            <w:proofErr w:type="spellEnd"/>
-            <w:r>
-              <w:rPr>
-                <w:rFonts w:asciiTheme="majorBidi" w:eastAsiaTheme="minorEastAsia" w:hAnsiTheme="majorBidi" w:cstheme="majorBidi"/>
-                <w:sz w:val="21"/>
-                <w:szCs w:val="21"/>
-                <w:lang w:val="en-US"/>
-              </w:rPr>
-              <w:t>_(</w:t>
-            </w:r>
-            <w:proofErr w:type="spellStart"/>
-            <w:r>
-              <w:rPr>
-                <w:rFonts w:asciiTheme="majorBidi" w:eastAsiaTheme="minorEastAsia" w:hAnsiTheme="majorBidi" w:cstheme="majorBidi"/>
-                <w:sz w:val="21"/>
-                <w:szCs w:val="21"/>
-                <w:lang w:val="en-US"/>
-              </w:rPr>
-              <w:t>drop_high_Cooks</w:t>
-            </w:r>
-            <w:proofErr w:type="spellEnd"/>
-            <w:r>
-              <w:rPr>
-                <w:rFonts w:asciiTheme="majorBidi" w:eastAsiaTheme="minorEastAsia" w:hAnsiTheme="majorBidi" w:cstheme="majorBidi"/>
-                <w:sz w:val="21"/>
-                <w:szCs w:val="21"/>
-                <w:lang w:val="en-US"/>
-              </w:rPr>
-              <w:t>)</w:t>
+            <w:r>
+              <w:rPr>
+                <w:rFonts w:asciiTheme="majorBidi" w:eastAsiaTheme="minorEastAsia" w:hAnsiTheme="majorBidi" w:cstheme="majorBidi"/>
+                <w:sz w:val="21"/>
+                <w:szCs w:val="21"/>
+                <w:lang w:val="en-US"/>
+              </w:rPr>
+              <w:t>B_sensitivity_(drop_high_Cooks)</w:t>
             </w:r>
           </w:p>
         </w:tc>
@@ -12021,45 +11797,14 @@
                 <w:lang w:val="en-US"/>
               </w:rPr>
             </w:pPr>
-            <w:proofErr w:type="spellStart"/>
-            <w:r>
-              <w:rPr>
-                <w:rFonts w:asciiTheme="majorBidi" w:eastAsiaTheme="minorEastAsia" w:hAnsiTheme="majorBidi" w:cstheme="majorBidi"/>
-                <w:sz w:val="21"/>
-                <w:szCs w:val="21"/>
-                <w:lang w:val="en-US"/>
-              </w:rPr>
-              <w:t>B_sensitivity</w:t>
-            </w:r>
-            <w:proofErr w:type="spellEnd"/>
-            <w:r>
-              <w:rPr>
-                <w:rFonts w:asciiTheme="majorBidi" w:eastAsiaTheme="minorEastAsia" w:hAnsiTheme="majorBidi" w:cstheme="majorBidi"/>
-                <w:sz w:val="21"/>
-                <w:szCs w:val="21"/>
-                <w:lang w:val="en-US"/>
-              </w:rPr>
-              <w:t>_(</w:t>
-            </w:r>
-            <w:proofErr w:type="spellStart"/>
-            <w:r>
-              <w:rPr>
-                <w:rFonts w:asciiTheme="majorBidi" w:eastAsiaTheme="minorEastAsia" w:hAnsiTheme="majorBidi" w:cstheme="majorBidi"/>
-                <w:sz w:val="21"/>
-                <w:szCs w:val="21"/>
-                <w:lang w:val="en-US"/>
-              </w:rPr>
-              <w:t>drop_high_Cooks</w:t>
-            </w:r>
-            <w:proofErr w:type="spellEnd"/>
-            <w:r>
-              <w:rPr>
-                <w:rFonts w:asciiTheme="majorBidi" w:eastAsiaTheme="minorEastAsia" w:hAnsiTheme="majorBidi" w:cstheme="majorBidi"/>
-                <w:sz w:val="21"/>
-                <w:szCs w:val="21"/>
-                <w:lang w:val="en-US"/>
-              </w:rPr>
-              <w:t>)</w:t>
+            <w:r>
+              <w:rPr>
+                <w:rFonts w:asciiTheme="majorBidi" w:eastAsiaTheme="minorEastAsia" w:hAnsiTheme="majorBidi" w:cstheme="majorBidi"/>
+                <w:sz w:val="21"/>
+                <w:szCs w:val="21"/>
+                <w:lang w:val="en-US"/>
+              </w:rPr>
+              <w:t>B_sensitivity_(drop_high_Cooks)</w:t>
             </w:r>
           </w:p>
         </w:tc>
@@ -12259,45 +12004,14 @@
                 <w:lang w:val="en-US"/>
               </w:rPr>
             </w:pPr>
-            <w:proofErr w:type="spellStart"/>
-            <w:r>
-              <w:rPr>
-                <w:rFonts w:asciiTheme="majorBidi" w:eastAsiaTheme="minorEastAsia" w:hAnsiTheme="majorBidi" w:cstheme="majorBidi"/>
-                <w:sz w:val="21"/>
-                <w:szCs w:val="21"/>
-                <w:lang w:val="en-US"/>
-              </w:rPr>
-              <w:t>B_sensitivity</w:t>
-            </w:r>
-            <w:proofErr w:type="spellEnd"/>
-            <w:r>
-              <w:rPr>
-                <w:rFonts w:asciiTheme="majorBidi" w:eastAsiaTheme="minorEastAsia" w:hAnsiTheme="majorBidi" w:cstheme="majorBidi"/>
-                <w:sz w:val="21"/>
-                <w:szCs w:val="21"/>
-                <w:lang w:val="en-US"/>
-              </w:rPr>
-              <w:t>_(</w:t>
-            </w:r>
-            <w:proofErr w:type="spellStart"/>
-            <w:r>
-              <w:rPr>
-                <w:rFonts w:asciiTheme="majorBidi" w:eastAsiaTheme="minorEastAsia" w:hAnsiTheme="majorBidi" w:cstheme="majorBidi"/>
-                <w:sz w:val="21"/>
-                <w:szCs w:val="21"/>
-                <w:lang w:val="en-US"/>
-              </w:rPr>
-              <w:t>drop_high_Cooks</w:t>
-            </w:r>
-            <w:proofErr w:type="spellEnd"/>
-            <w:r>
-              <w:rPr>
-                <w:rFonts w:asciiTheme="majorBidi" w:eastAsiaTheme="minorEastAsia" w:hAnsiTheme="majorBidi" w:cstheme="majorBidi"/>
-                <w:sz w:val="21"/>
-                <w:szCs w:val="21"/>
-                <w:lang w:val="en-US"/>
-              </w:rPr>
-              <w:t>)</w:t>
+            <w:r>
+              <w:rPr>
+                <w:rFonts w:asciiTheme="majorBidi" w:eastAsiaTheme="minorEastAsia" w:hAnsiTheme="majorBidi" w:cstheme="majorBidi"/>
+                <w:sz w:val="21"/>
+                <w:szCs w:val="21"/>
+                <w:lang w:val="en-US"/>
+              </w:rPr>
+              <w:t>B_sensitivity_(drop_high_Cooks)</w:t>
             </w:r>
           </w:p>
         </w:tc>
@@ -12497,45 +12211,14 @@
                 <w:lang w:val="en-US"/>
               </w:rPr>
             </w:pPr>
-            <w:proofErr w:type="spellStart"/>
-            <w:r>
-              <w:rPr>
-                <w:rFonts w:asciiTheme="majorBidi" w:eastAsiaTheme="minorEastAsia" w:hAnsiTheme="majorBidi" w:cstheme="majorBidi"/>
-                <w:sz w:val="21"/>
-                <w:szCs w:val="21"/>
-                <w:lang w:val="en-US"/>
-              </w:rPr>
-              <w:t>B_sensitivity</w:t>
-            </w:r>
-            <w:proofErr w:type="spellEnd"/>
-            <w:r>
-              <w:rPr>
-                <w:rFonts w:asciiTheme="majorBidi" w:eastAsiaTheme="minorEastAsia" w:hAnsiTheme="majorBidi" w:cstheme="majorBidi"/>
-                <w:sz w:val="21"/>
-                <w:szCs w:val="21"/>
-                <w:lang w:val="en-US"/>
-              </w:rPr>
-              <w:t>_(</w:t>
-            </w:r>
-            <w:proofErr w:type="spellStart"/>
-            <w:r>
-              <w:rPr>
-                <w:rFonts w:asciiTheme="majorBidi" w:eastAsiaTheme="minorEastAsia" w:hAnsiTheme="majorBidi" w:cstheme="majorBidi"/>
-                <w:sz w:val="21"/>
-                <w:szCs w:val="21"/>
-                <w:lang w:val="en-US"/>
-              </w:rPr>
-              <w:t>drop_high_Cooks</w:t>
-            </w:r>
-            <w:proofErr w:type="spellEnd"/>
-            <w:r>
-              <w:rPr>
-                <w:rFonts w:asciiTheme="majorBidi" w:eastAsiaTheme="minorEastAsia" w:hAnsiTheme="majorBidi" w:cstheme="majorBidi"/>
-                <w:sz w:val="21"/>
-                <w:szCs w:val="21"/>
-                <w:lang w:val="en-US"/>
-              </w:rPr>
-              <w:t>)</w:t>
+            <w:r>
+              <w:rPr>
+                <w:rFonts w:asciiTheme="majorBidi" w:eastAsiaTheme="minorEastAsia" w:hAnsiTheme="majorBidi" w:cstheme="majorBidi"/>
+                <w:sz w:val="21"/>
+                <w:szCs w:val="21"/>
+                <w:lang w:val="en-US"/>
+              </w:rPr>
+              <w:t>B_sensitivity_(drop_high_Cooks)</w:t>
             </w:r>
           </w:p>
         </w:tc>
@@ -12739,45 +12422,14 @@
                 <w:lang w:val="en-US"/>
               </w:rPr>
             </w:pPr>
-            <w:proofErr w:type="spellStart"/>
-            <w:r>
-              <w:rPr>
-                <w:rFonts w:asciiTheme="majorBidi" w:eastAsiaTheme="minorEastAsia" w:hAnsiTheme="majorBidi" w:cstheme="majorBidi"/>
-                <w:sz w:val="21"/>
-                <w:szCs w:val="21"/>
-                <w:lang w:val="en-US"/>
-              </w:rPr>
-              <w:t>B_sensitivity</w:t>
-            </w:r>
-            <w:proofErr w:type="spellEnd"/>
-            <w:r>
-              <w:rPr>
-                <w:rFonts w:asciiTheme="majorBidi" w:eastAsiaTheme="minorEastAsia" w:hAnsiTheme="majorBidi" w:cstheme="majorBidi"/>
-                <w:sz w:val="21"/>
-                <w:szCs w:val="21"/>
-                <w:lang w:val="en-US"/>
-              </w:rPr>
-              <w:t>_(</w:t>
-            </w:r>
-            <w:proofErr w:type="spellStart"/>
-            <w:r>
-              <w:rPr>
-                <w:rFonts w:asciiTheme="majorBidi" w:eastAsiaTheme="minorEastAsia" w:hAnsiTheme="majorBidi" w:cstheme="majorBidi"/>
-                <w:sz w:val="21"/>
-                <w:szCs w:val="21"/>
-                <w:lang w:val="en-US"/>
-              </w:rPr>
-              <w:t>drop_high_Cooks</w:t>
-            </w:r>
-            <w:proofErr w:type="spellEnd"/>
-            <w:r>
-              <w:rPr>
-                <w:rFonts w:asciiTheme="majorBidi" w:eastAsiaTheme="minorEastAsia" w:hAnsiTheme="majorBidi" w:cstheme="majorBidi"/>
-                <w:sz w:val="21"/>
-                <w:szCs w:val="21"/>
-                <w:lang w:val="en-US"/>
-              </w:rPr>
-              <w:t>)</w:t>
+            <w:r>
+              <w:rPr>
+                <w:rFonts w:asciiTheme="majorBidi" w:eastAsiaTheme="minorEastAsia" w:hAnsiTheme="majorBidi" w:cstheme="majorBidi"/>
+                <w:sz w:val="21"/>
+                <w:szCs w:val="21"/>
+                <w:lang w:val="en-US"/>
+              </w:rPr>
+              <w:t>B_sensitivity_(drop_high_Cooks)</w:t>
             </w:r>
           </w:p>
         </w:tc>
@@ -12977,45 +12629,14 @@
                 <w:lang w:val="en-US"/>
               </w:rPr>
             </w:pPr>
-            <w:proofErr w:type="spellStart"/>
-            <w:r>
-              <w:rPr>
-                <w:rFonts w:asciiTheme="majorBidi" w:eastAsiaTheme="minorEastAsia" w:hAnsiTheme="majorBidi" w:cstheme="majorBidi"/>
-                <w:sz w:val="21"/>
-                <w:szCs w:val="21"/>
-                <w:lang w:val="en-US"/>
-              </w:rPr>
-              <w:t>B_sensitivity</w:t>
-            </w:r>
-            <w:proofErr w:type="spellEnd"/>
-            <w:r>
-              <w:rPr>
-                <w:rFonts w:asciiTheme="majorBidi" w:eastAsiaTheme="minorEastAsia" w:hAnsiTheme="majorBidi" w:cstheme="majorBidi"/>
-                <w:sz w:val="21"/>
-                <w:szCs w:val="21"/>
-                <w:lang w:val="en-US"/>
-              </w:rPr>
-              <w:t>_(</w:t>
-            </w:r>
-            <w:proofErr w:type="spellStart"/>
-            <w:r>
-              <w:rPr>
-                <w:rFonts w:asciiTheme="majorBidi" w:eastAsiaTheme="minorEastAsia" w:hAnsiTheme="majorBidi" w:cstheme="majorBidi"/>
-                <w:sz w:val="21"/>
-                <w:szCs w:val="21"/>
-                <w:lang w:val="en-US"/>
-              </w:rPr>
-              <w:t>drop_high_Cooks</w:t>
-            </w:r>
-            <w:proofErr w:type="spellEnd"/>
-            <w:r>
-              <w:rPr>
-                <w:rFonts w:asciiTheme="majorBidi" w:eastAsiaTheme="minorEastAsia" w:hAnsiTheme="majorBidi" w:cstheme="majorBidi"/>
-                <w:sz w:val="21"/>
-                <w:szCs w:val="21"/>
-                <w:lang w:val="en-US"/>
-              </w:rPr>
-              <w:t>)</w:t>
+            <w:r>
+              <w:rPr>
+                <w:rFonts w:asciiTheme="majorBidi" w:eastAsiaTheme="minorEastAsia" w:hAnsiTheme="majorBidi" w:cstheme="majorBidi"/>
+                <w:sz w:val="21"/>
+                <w:szCs w:val="21"/>
+                <w:lang w:val="en-US"/>
+              </w:rPr>
+              <w:t>B_sensitivity_(drop_high_Cooks)</w:t>
             </w:r>
           </w:p>
         </w:tc>
@@ -13215,7 +12836,6 @@
                 <w:lang w:val="en-US"/>
               </w:rPr>
             </w:pPr>
-            <w:proofErr w:type="spellStart"/>
             <w:r>
               <w:rPr>
                 <w:rFonts w:asciiTheme="majorBidi" w:eastAsiaTheme="minorEastAsia" w:hAnsiTheme="majorBidi" w:cstheme="majorBidi"/>
@@ -13225,7 +12845,6 @@
               </w:rPr>
               <w:t>C_controls+DT+HEXACO+DTxHH</w:t>
             </w:r>
-            <w:proofErr w:type="spellEnd"/>
           </w:p>
         </w:tc>
         <w:tc>
@@ -13424,7 +13043,6 @@
                 <w:lang w:val="en-US"/>
               </w:rPr>
             </w:pPr>
-            <w:proofErr w:type="spellStart"/>
             <w:r>
               <w:rPr>
                 <w:rFonts w:asciiTheme="majorBidi" w:eastAsiaTheme="minorEastAsia" w:hAnsiTheme="majorBidi" w:cstheme="majorBidi"/>
@@ -13434,7 +13052,6 @@
               </w:rPr>
               <w:t>C_controls+DT+HEXACO+DTxHH</w:t>
             </w:r>
-            <w:proofErr w:type="spellEnd"/>
           </w:p>
         </w:tc>
         <w:tc>
@@ -13633,7 +13250,6 @@
                 <w:lang w:val="en-US"/>
               </w:rPr>
             </w:pPr>
-            <w:proofErr w:type="spellStart"/>
             <w:r>
               <w:rPr>
                 <w:rFonts w:asciiTheme="majorBidi" w:eastAsiaTheme="minorEastAsia" w:hAnsiTheme="majorBidi" w:cstheme="majorBidi"/>
@@ -13643,7 +13259,6 @@
               </w:rPr>
               <w:t>C_controls+DT+HEXACO+DTxHH</w:t>
             </w:r>
-            <w:proofErr w:type="spellEnd"/>
           </w:p>
         </w:tc>
         <w:tc>
@@ -13846,7 +13461,6 @@
                 <w:lang w:val="en-US"/>
               </w:rPr>
             </w:pPr>
-            <w:proofErr w:type="spellStart"/>
             <w:r>
               <w:rPr>
                 <w:rFonts w:asciiTheme="majorBidi" w:eastAsiaTheme="minorEastAsia" w:hAnsiTheme="majorBidi" w:cstheme="majorBidi"/>
@@ -13856,7 +13470,6 @@
               </w:rPr>
               <w:t>C_controls+DT+HEXACO+DTxHH</w:t>
             </w:r>
-            <w:proofErr w:type="spellEnd"/>
           </w:p>
         </w:tc>
         <w:tc>
@@ -14055,7 +13668,6 @@
                 <w:lang w:val="en-US"/>
               </w:rPr>
             </w:pPr>
-            <w:proofErr w:type="spellStart"/>
             <w:r>
               <w:rPr>
                 <w:rFonts w:asciiTheme="majorBidi" w:eastAsiaTheme="minorEastAsia" w:hAnsiTheme="majorBidi" w:cstheme="majorBidi"/>
@@ -14065,7 +13677,6 @@
               </w:rPr>
               <w:t>C_controls+DT+HEXACO+DTxHH</w:t>
             </w:r>
-            <w:proofErr w:type="spellEnd"/>
           </w:p>
         </w:tc>
         <w:tc>
@@ -14264,7 +13875,6 @@
                 <w:lang w:val="en-US"/>
               </w:rPr>
             </w:pPr>
-            <w:proofErr w:type="spellStart"/>
             <w:r>
               <w:rPr>
                 <w:rFonts w:asciiTheme="majorBidi" w:eastAsiaTheme="minorEastAsia" w:hAnsiTheme="majorBidi" w:cstheme="majorBidi"/>
@@ -14274,7 +13884,6 @@
               </w:rPr>
               <w:t>C_controls+DT+HEXACO+DTxHH</w:t>
             </w:r>
-            <w:proofErr w:type="spellEnd"/>
           </w:p>
         </w:tc>
         <w:tc>
@@ -14473,7 +14082,6 @@
                 <w:lang w:val="en-US"/>
               </w:rPr>
             </w:pPr>
-            <w:proofErr w:type="spellStart"/>
             <w:r>
               <w:rPr>
                 <w:rFonts w:asciiTheme="majorBidi" w:eastAsiaTheme="minorEastAsia" w:hAnsiTheme="majorBidi" w:cstheme="majorBidi"/>
@@ -14483,7 +14091,6 @@
               </w:rPr>
               <w:t>C_controls+DT+HEXACO+DTxHH</w:t>
             </w:r>
-            <w:proofErr w:type="spellEnd"/>
           </w:p>
         </w:tc>
         <w:tc>
@@ -14682,7 +14289,6 @@
                 <w:lang w:val="en-US"/>
               </w:rPr>
             </w:pPr>
-            <w:proofErr w:type="spellStart"/>
             <w:r>
               <w:rPr>
                 <w:rFonts w:asciiTheme="majorBidi" w:eastAsiaTheme="minorEastAsia" w:hAnsiTheme="majorBidi" w:cstheme="majorBidi"/>
@@ -14692,7 +14298,6 @@
               </w:rPr>
               <w:t>C_controls+DT+HEXACO+DTxHH</w:t>
             </w:r>
-            <w:proofErr w:type="spellEnd"/>
           </w:p>
         </w:tc>
         <w:tc>
@@ -14897,7 +14502,6 @@
                 <w:lang w:val="en-US"/>
               </w:rPr>
             </w:pPr>
-            <w:proofErr w:type="spellStart"/>
             <w:r>
               <w:rPr>
                 <w:rFonts w:asciiTheme="majorBidi" w:eastAsiaTheme="minorEastAsia" w:hAnsiTheme="majorBidi" w:cstheme="majorBidi"/>
@@ -14907,7 +14511,6 @@
               </w:rPr>
               <w:t>C_controls+DT+HEXACO+DTxHH</w:t>
             </w:r>
-            <w:proofErr w:type="spellEnd"/>
           </w:p>
         </w:tc>
         <w:tc>
@@ -15093,47 +14696,7 @@
                 <w:szCs w:val="21"/>
                 <w:lang w:val="en-US"/>
               </w:rPr>
-              <w:t xml:space="preserve">Model B = controls (age, gender, region) + Dark Triad (M, N, P) + HEXACO (H–H, E, X, A, C, O). Internal labels: </w:t>
-            </w:r>
-            <w:proofErr w:type="spellStart"/>
-            <w:r>
-              <w:rPr>
-                <w:rFonts w:asciiTheme="majorBidi" w:eastAsiaTheme="minorEastAsia" w:hAnsiTheme="majorBidi" w:cstheme="majorBidi"/>
-                <w:sz w:val="21"/>
-                <w:szCs w:val="21"/>
-                <w:lang w:val="en-US"/>
-              </w:rPr>
-              <w:t>B_controls+DT+HEXACO</w:t>
-            </w:r>
-            <w:proofErr w:type="spellEnd"/>
-            <w:r>
-              <w:rPr>
-                <w:rFonts w:asciiTheme="majorBidi" w:eastAsiaTheme="minorEastAsia" w:hAnsiTheme="majorBidi" w:cstheme="majorBidi"/>
-                <w:sz w:val="21"/>
-                <w:szCs w:val="21"/>
-                <w:lang w:val="en-US"/>
-              </w:rPr>
-              <w:t xml:space="preserve"> = Model B (overall); </w:t>
-            </w:r>
-            <w:proofErr w:type="spellStart"/>
-            <w:r>
-              <w:rPr>
-                <w:rFonts w:asciiTheme="majorBidi" w:eastAsiaTheme="minorEastAsia" w:hAnsiTheme="majorBidi" w:cstheme="majorBidi"/>
-                <w:sz w:val="21"/>
-                <w:szCs w:val="21"/>
-                <w:lang w:val="en-US"/>
-              </w:rPr>
-              <w:t>B_by_gender</w:t>
-            </w:r>
-            <w:proofErr w:type="spellEnd"/>
-            <w:r>
-              <w:rPr>
-                <w:rFonts w:asciiTheme="majorBidi" w:eastAsiaTheme="minorEastAsia" w:hAnsiTheme="majorBidi" w:cstheme="majorBidi"/>
-                <w:sz w:val="21"/>
-                <w:szCs w:val="21"/>
-                <w:lang w:val="en-US"/>
-              </w:rPr>
-              <w:t xml:space="preserve"> = Model B estimated separately by gender. Standardized β; HC3 robust SE; two-tailed tests; *** </w:t>
+              <w:t xml:space="preserve">Model B = controls (age, gender, region) + Dark Triad (M, N, P) + HEXACO (H–H, E, X, A, C, O). Internal labels: B_controls+DT+HEXACO = Model B (overall); B_by_gender = Model B estimated separately by gender. Standardized β; HC3 robust SE; two-tailed tests; *** </w:t>
             </w:r>
             <w:r>
               <w:rPr>
@@ -15528,7 +15091,6 @@
                 <w:lang w:val="en-US"/>
               </w:rPr>
             </w:pPr>
-            <w:proofErr w:type="spellStart"/>
             <w:r>
               <w:rPr>
                 <w:rFonts w:asciiTheme="majorBidi" w:eastAsiaTheme="minorEastAsia" w:hAnsiTheme="majorBidi" w:cstheme="majorBidi"/>
@@ -15538,7 +15100,6 @@
               </w:rPr>
               <w:t>B_by_gender</w:t>
             </w:r>
-            <w:proofErr w:type="spellEnd"/>
           </w:p>
         </w:tc>
         <w:tc>
@@ -15737,7 +15298,6 @@
                 <w:lang w:val="en-US"/>
               </w:rPr>
             </w:pPr>
-            <w:proofErr w:type="spellStart"/>
             <w:r>
               <w:rPr>
                 <w:rFonts w:asciiTheme="majorBidi" w:eastAsiaTheme="minorEastAsia" w:hAnsiTheme="majorBidi" w:cstheme="majorBidi"/>
@@ -15747,7 +15307,6 @@
               </w:rPr>
               <w:t>B_by_gender</w:t>
             </w:r>
-            <w:proofErr w:type="spellEnd"/>
           </w:p>
         </w:tc>
         <w:tc>
@@ -15946,7 +15505,6 @@
                 <w:lang w:val="en-US"/>
               </w:rPr>
             </w:pPr>
-            <w:proofErr w:type="spellStart"/>
             <w:r>
               <w:rPr>
                 <w:rFonts w:asciiTheme="majorBidi" w:eastAsiaTheme="minorEastAsia" w:hAnsiTheme="majorBidi" w:cstheme="majorBidi"/>
@@ -15956,7 +15514,6 @@
               </w:rPr>
               <w:t>B_by_gender</w:t>
             </w:r>
-            <w:proofErr w:type="spellEnd"/>
           </w:p>
         </w:tc>
         <w:tc>
@@ -16159,7 +15716,6 @@
                 <w:lang w:val="en-US"/>
               </w:rPr>
             </w:pPr>
-            <w:proofErr w:type="spellStart"/>
             <w:r>
               <w:rPr>
                 <w:rFonts w:asciiTheme="majorBidi" w:eastAsiaTheme="minorEastAsia" w:hAnsiTheme="majorBidi" w:cstheme="majorBidi"/>
@@ -16169,7 +15725,6 @@
               </w:rPr>
               <w:t>B_by_gender</w:t>
             </w:r>
-            <w:proofErr w:type="spellEnd"/>
           </w:p>
         </w:tc>
         <w:tc>
@@ -16368,7 +15923,6 @@
                 <w:lang w:val="en-US"/>
               </w:rPr>
             </w:pPr>
-            <w:proofErr w:type="spellStart"/>
             <w:r>
               <w:rPr>
                 <w:rFonts w:asciiTheme="majorBidi" w:eastAsiaTheme="minorEastAsia" w:hAnsiTheme="majorBidi" w:cstheme="majorBidi"/>
@@ -16378,7 +15932,6 @@
               </w:rPr>
               <w:t>B_by_gender</w:t>
             </w:r>
-            <w:proofErr w:type="spellEnd"/>
           </w:p>
         </w:tc>
         <w:tc>
@@ -16577,7 +16130,6 @@
                 <w:lang w:val="en-US"/>
               </w:rPr>
             </w:pPr>
-            <w:proofErr w:type="spellStart"/>
             <w:r>
               <w:rPr>
                 <w:rFonts w:asciiTheme="majorBidi" w:eastAsiaTheme="minorEastAsia" w:hAnsiTheme="majorBidi" w:cstheme="majorBidi"/>
@@ -16587,7 +16139,6 @@
               </w:rPr>
               <w:t>B_by_gender</w:t>
             </w:r>
-            <w:proofErr w:type="spellEnd"/>
           </w:p>
         </w:tc>
         <w:tc>
@@ -16786,7 +16337,6 @@
                 <w:lang w:val="en-US"/>
               </w:rPr>
             </w:pPr>
-            <w:proofErr w:type="spellStart"/>
             <w:r>
               <w:rPr>
                 <w:rFonts w:asciiTheme="majorBidi" w:eastAsiaTheme="minorEastAsia" w:hAnsiTheme="majorBidi" w:cstheme="majorBidi"/>
@@ -16796,7 +16346,6 @@
               </w:rPr>
               <w:t>B_by_gender</w:t>
             </w:r>
-            <w:proofErr w:type="spellEnd"/>
           </w:p>
         </w:tc>
         <w:tc>
@@ -16995,7 +16544,6 @@
                 <w:lang w:val="en-US"/>
               </w:rPr>
             </w:pPr>
-            <w:proofErr w:type="spellStart"/>
             <w:r>
               <w:rPr>
                 <w:rFonts w:asciiTheme="majorBidi" w:eastAsiaTheme="minorEastAsia" w:hAnsiTheme="majorBidi" w:cstheme="majorBidi"/>
@@ -17005,7 +16553,6 @@
               </w:rPr>
               <w:t>B_by_gender</w:t>
             </w:r>
-            <w:proofErr w:type="spellEnd"/>
           </w:p>
         </w:tc>
         <w:tc>
@@ -17204,7 +16751,6 @@
                 <w:lang w:val="en-US"/>
               </w:rPr>
             </w:pPr>
-            <w:proofErr w:type="spellStart"/>
             <w:r>
               <w:rPr>
                 <w:rFonts w:asciiTheme="majorBidi" w:eastAsiaTheme="minorEastAsia" w:hAnsiTheme="majorBidi" w:cstheme="majorBidi"/>
@@ -17214,7 +16760,6 @@
               </w:rPr>
               <w:t>B_by_gender</w:t>
             </w:r>
-            <w:proofErr w:type="spellEnd"/>
           </w:p>
         </w:tc>
         <w:tc>
@@ -17413,7 +16958,6 @@
                 <w:lang w:val="en-US"/>
               </w:rPr>
             </w:pPr>
-            <w:proofErr w:type="spellStart"/>
             <w:r>
               <w:rPr>
                 <w:rFonts w:asciiTheme="majorBidi" w:eastAsiaTheme="minorEastAsia" w:hAnsiTheme="majorBidi" w:cstheme="majorBidi"/>
@@ -17423,7 +16967,6 @@
               </w:rPr>
               <w:t>B_by_gender</w:t>
             </w:r>
-            <w:proofErr w:type="spellEnd"/>
           </w:p>
         </w:tc>
         <w:tc>
@@ -17622,7 +17165,6 @@
                 <w:lang w:val="en-US"/>
               </w:rPr>
             </w:pPr>
-            <w:proofErr w:type="spellStart"/>
             <w:r>
               <w:rPr>
                 <w:rFonts w:asciiTheme="majorBidi" w:eastAsiaTheme="minorEastAsia" w:hAnsiTheme="majorBidi" w:cstheme="majorBidi"/>
@@ -17632,7 +17174,6 @@
               </w:rPr>
               <w:t>B_by_gender</w:t>
             </w:r>
-            <w:proofErr w:type="spellEnd"/>
           </w:p>
         </w:tc>
         <w:tc>
@@ -17831,7 +17372,6 @@
                 <w:lang w:val="en-US"/>
               </w:rPr>
             </w:pPr>
-            <w:proofErr w:type="spellStart"/>
             <w:r>
               <w:rPr>
                 <w:rFonts w:asciiTheme="majorBidi" w:eastAsiaTheme="minorEastAsia" w:hAnsiTheme="majorBidi" w:cstheme="majorBidi"/>
@@ -17841,7 +17381,6 @@
               </w:rPr>
               <w:t>B_by_gender</w:t>
             </w:r>
-            <w:proofErr w:type="spellEnd"/>
           </w:p>
         </w:tc>
         <w:tc>
@@ -18044,7 +17583,6 @@
                 <w:lang w:val="en-US"/>
               </w:rPr>
             </w:pPr>
-            <w:proofErr w:type="spellStart"/>
             <w:r>
               <w:rPr>
                 <w:rFonts w:asciiTheme="majorBidi" w:eastAsiaTheme="minorEastAsia" w:hAnsiTheme="majorBidi" w:cstheme="majorBidi"/>
@@ -18054,7 +17592,6 @@
               </w:rPr>
               <w:t>B_by_gender</w:t>
             </w:r>
-            <w:proofErr w:type="spellEnd"/>
           </w:p>
         </w:tc>
         <w:tc>
@@ -18257,7 +17794,6 @@
                 <w:lang w:val="en-US"/>
               </w:rPr>
             </w:pPr>
-            <w:proofErr w:type="spellStart"/>
             <w:r>
               <w:rPr>
                 <w:rFonts w:asciiTheme="majorBidi" w:eastAsiaTheme="minorEastAsia" w:hAnsiTheme="majorBidi" w:cstheme="majorBidi"/>
@@ -18267,7 +17803,6 @@
               </w:rPr>
               <w:t>B_by_gender</w:t>
             </w:r>
-            <w:proofErr w:type="spellEnd"/>
           </w:p>
         </w:tc>
         <w:tc>
@@ -18466,7 +18001,6 @@
                 <w:lang w:val="en-US"/>
               </w:rPr>
             </w:pPr>
-            <w:proofErr w:type="spellStart"/>
             <w:r>
               <w:rPr>
                 <w:rFonts w:asciiTheme="majorBidi" w:eastAsiaTheme="minorEastAsia" w:hAnsiTheme="majorBidi" w:cstheme="majorBidi"/>
@@ -18476,7 +18010,6 @@
               </w:rPr>
               <w:t>B_by_gender</w:t>
             </w:r>
-            <w:proofErr w:type="spellEnd"/>
           </w:p>
         </w:tc>
         <w:tc>
@@ -18675,7 +18208,6 @@
                 <w:lang w:val="en-US"/>
               </w:rPr>
             </w:pPr>
-            <w:proofErr w:type="spellStart"/>
             <w:r>
               <w:rPr>
                 <w:rFonts w:asciiTheme="majorBidi" w:eastAsiaTheme="minorEastAsia" w:hAnsiTheme="majorBidi" w:cstheme="majorBidi"/>
@@ -18685,7 +18217,6 @@
               </w:rPr>
               <w:t>B_by_gender</w:t>
             </w:r>
-            <w:proofErr w:type="spellEnd"/>
           </w:p>
         </w:tc>
         <w:tc>
@@ -18888,7 +18419,6 @@
                 <w:lang w:val="en-US"/>
               </w:rPr>
             </w:pPr>
-            <w:proofErr w:type="spellStart"/>
             <w:r>
               <w:rPr>
                 <w:rFonts w:asciiTheme="majorBidi" w:eastAsiaTheme="minorEastAsia" w:hAnsiTheme="majorBidi" w:cstheme="majorBidi"/>
@@ -18898,7 +18428,6 @@
               </w:rPr>
               <w:t>B_by_gender</w:t>
             </w:r>
-            <w:proofErr w:type="spellEnd"/>
           </w:p>
         </w:tc>
         <w:tc>
@@ -19103,7 +18632,6 @@
                 <w:lang w:val="en-US"/>
               </w:rPr>
             </w:pPr>
-            <w:proofErr w:type="spellStart"/>
             <w:r>
               <w:rPr>
                 <w:rFonts w:asciiTheme="majorBidi" w:eastAsiaTheme="minorEastAsia" w:hAnsiTheme="majorBidi" w:cstheme="majorBidi"/>
@@ -19113,7 +18641,6 @@
               </w:rPr>
               <w:t>B_by_gender</w:t>
             </w:r>
-            <w:proofErr w:type="spellEnd"/>
           </w:p>
         </w:tc>
         <w:tc>
@@ -19299,47 +18826,7 @@
                 <w:szCs w:val="21"/>
                 <w:lang w:val="en-US"/>
               </w:rPr>
-              <w:t xml:space="preserve">Model B = controls (age, gender, region) + Dark Triad (M, N, P) + HEXACO (H–H, E, X, A, C, O). Internal labels: </w:t>
-            </w:r>
-            <w:proofErr w:type="spellStart"/>
-            <w:r>
-              <w:rPr>
-                <w:rFonts w:asciiTheme="majorBidi" w:eastAsiaTheme="minorEastAsia" w:hAnsiTheme="majorBidi" w:cstheme="majorBidi"/>
-                <w:sz w:val="21"/>
-                <w:szCs w:val="21"/>
-                <w:lang w:val="en-US"/>
-              </w:rPr>
-              <w:t>B_controls+DT+HEXACO</w:t>
-            </w:r>
-            <w:proofErr w:type="spellEnd"/>
-            <w:r>
-              <w:rPr>
-                <w:rFonts w:asciiTheme="majorBidi" w:eastAsiaTheme="minorEastAsia" w:hAnsiTheme="majorBidi" w:cstheme="majorBidi"/>
-                <w:sz w:val="21"/>
-                <w:szCs w:val="21"/>
-                <w:lang w:val="en-US"/>
-              </w:rPr>
-              <w:t xml:space="preserve"> = Model B (overall); </w:t>
-            </w:r>
-            <w:proofErr w:type="spellStart"/>
-            <w:r>
-              <w:rPr>
-                <w:rFonts w:asciiTheme="majorBidi" w:eastAsiaTheme="minorEastAsia" w:hAnsiTheme="majorBidi" w:cstheme="majorBidi"/>
-                <w:sz w:val="21"/>
-                <w:szCs w:val="21"/>
-                <w:lang w:val="en-US"/>
-              </w:rPr>
-              <w:t>B_by_gender</w:t>
-            </w:r>
-            <w:proofErr w:type="spellEnd"/>
-            <w:r>
-              <w:rPr>
-                <w:rFonts w:asciiTheme="majorBidi" w:eastAsiaTheme="minorEastAsia" w:hAnsiTheme="majorBidi" w:cstheme="majorBidi"/>
-                <w:sz w:val="21"/>
-                <w:szCs w:val="21"/>
-                <w:lang w:val="en-US"/>
-              </w:rPr>
-              <w:t xml:space="preserve"> = Model B estimated separately by gender. Standardized β; HC3 robust SE; two-tailed tests; *** </w:t>
+              <w:t xml:space="preserve">Model B = controls (age, gender, region) + Dark Triad (M, N, P) + HEXACO (H–H, E, X, A, C, O). Internal labels: B_controls+DT+HEXACO = Model B (overall); B_by_gender = Model B estimated separately by gender. Standardized β; HC3 robust SE; two-tailed tests; *** </w:t>
             </w:r>
             <w:r>
               <w:rPr>
@@ -19734,7 +19221,6 @@
                 <w:lang w:val="en-US"/>
               </w:rPr>
             </w:pPr>
-            <w:proofErr w:type="spellStart"/>
             <w:r>
               <w:rPr>
                 <w:rFonts w:asciiTheme="majorBidi" w:eastAsiaTheme="minorEastAsia" w:hAnsiTheme="majorBidi" w:cstheme="majorBidi"/>
@@ -19744,7 +19230,6 @@
               </w:rPr>
               <w:t>A_controls+DT</w:t>
             </w:r>
-            <w:proofErr w:type="spellEnd"/>
           </w:p>
         </w:tc>
         <w:tc>
@@ -19947,7 +19432,6 @@
                 <w:lang w:val="en-US"/>
               </w:rPr>
             </w:pPr>
-            <w:proofErr w:type="spellStart"/>
             <w:r>
               <w:rPr>
                 <w:rFonts w:asciiTheme="majorBidi" w:eastAsiaTheme="minorEastAsia" w:hAnsiTheme="majorBidi" w:cstheme="majorBidi"/>
@@ -19957,7 +19441,6 @@
               </w:rPr>
               <w:t>A_controls+DT</w:t>
             </w:r>
-            <w:proofErr w:type="spellEnd"/>
           </w:p>
         </w:tc>
         <w:tc>
@@ -20160,7 +19643,6 @@
                 <w:lang w:val="en-US"/>
               </w:rPr>
             </w:pPr>
-            <w:proofErr w:type="spellStart"/>
             <w:r>
               <w:rPr>
                 <w:rFonts w:asciiTheme="majorBidi" w:eastAsiaTheme="minorEastAsia" w:hAnsiTheme="majorBidi" w:cstheme="majorBidi"/>
@@ -20170,7 +19652,6 @@
               </w:rPr>
               <w:t>A_controls+DT</w:t>
             </w:r>
-            <w:proofErr w:type="spellEnd"/>
           </w:p>
         </w:tc>
         <w:tc>
@@ -20373,7 +19854,6 @@
                 <w:lang w:val="en-US"/>
               </w:rPr>
             </w:pPr>
-            <w:proofErr w:type="spellStart"/>
             <w:r>
               <w:rPr>
                 <w:rFonts w:asciiTheme="majorBidi" w:eastAsiaTheme="minorEastAsia" w:hAnsiTheme="majorBidi" w:cstheme="majorBidi"/>
@@ -20383,7 +19863,6 @@
               </w:rPr>
               <w:t>B_controls+DT+HEXACO</w:t>
             </w:r>
-            <w:proofErr w:type="spellEnd"/>
           </w:p>
         </w:tc>
         <w:tc>
@@ -20586,7 +20065,6 @@
                 <w:lang w:val="en-US"/>
               </w:rPr>
             </w:pPr>
-            <w:proofErr w:type="spellStart"/>
             <w:r>
               <w:rPr>
                 <w:rFonts w:asciiTheme="majorBidi" w:eastAsiaTheme="minorEastAsia" w:hAnsiTheme="majorBidi" w:cstheme="majorBidi"/>
@@ -20596,7 +20074,6 @@
               </w:rPr>
               <w:t>B_controls+DT+HEXACO</w:t>
             </w:r>
-            <w:proofErr w:type="spellEnd"/>
           </w:p>
         </w:tc>
         <w:tc>
@@ -20799,7 +20276,6 @@
                 <w:lang w:val="en-US"/>
               </w:rPr>
             </w:pPr>
-            <w:proofErr w:type="spellStart"/>
             <w:r>
               <w:rPr>
                 <w:rFonts w:asciiTheme="majorBidi" w:eastAsiaTheme="minorEastAsia" w:hAnsiTheme="majorBidi" w:cstheme="majorBidi"/>
@@ -20809,7 +20285,6 @@
               </w:rPr>
               <w:t>B_controls+DT+HEXACO</w:t>
             </w:r>
-            <w:proofErr w:type="spellEnd"/>
           </w:p>
         </w:tc>
         <w:tc>
@@ -21012,7 +20487,6 @@
                 <w:lang w:val="en-US"/>
               </w:rPr>
             </w:pPr>
-            <w:proofErr w:type="spellStart"/>
             <w:r>
               <w:rPr>
                 <w:rFonts w:asciiTheme="majorBidi" w:eastAsiaTheme="minorEastAsia" w:hAnsiTheme="majorBidi" w:cstheme="majorBidi"/>
@@ -21022,7 +20496,6 @@
               </w:rPr>
               <w:t>B_controls+DT+HEXACO</w:t>
             </w:r>
-            <w:proofErr w:type="spellEnd"/>
           </w:p>
         </w:tc>
         <w:tc>
@@ -21225,7 +20698,6 @@
                 <w:lang w:val="en-US"/>
               </w:rPr>
             </w:pPr>
-            <w:proofErr w:type="spellStart"/>
             <w:r>
               <w:rPr>
                 <w:rFonts w:asciiTheme="majorBidi" w:eastAsiaTheme="minorEastAsia" w:hAnsiTheme="majorBidi" w:cstheme="majorBidi"/>
@@ -21235,7 +20707,6 @@
               </w:rPr>
               <w:t>B_controls+DT+HEXACO</w:t>
             </w:r>
-            <w:proofErr w:type="spellEnd"/>
           </w:p>
         </w:tc>
         <w:tc>
@@ -21434,7 +20905,6 @@
                 <w:lang w:val="en-US"/>
               </w:rPr>
             </w:pPr>
-            <w:proofErr w:type="spellStart"/>
             <w:r>
               <w:rPr>
                 <w:rFonts w:asciiTheme="majorBidi" w:eastAsiaTheme="minorEastAsia" w:hAnsiTheme="majorBidi" w:cstheme="majorBidi"/>
@@ -21444,7 +20914,6 @@
               </w:rPr>
               <w:t>B_controls+DT+HEXACO</w:t>
             </w:r>
-            <w:proofErr w:type="spellEnd"/>
           </w:p>
         </w:tc>
         <w:tc>
@@ -21643,7 +21112,6 @@
                 <w:lang w:val="en-US"/>
               </w:rPr>
             </w:pPr>
-            <w:proofErr w:type="spellStart"/>
             <w:r>
               <w:rPr>
                 <w:rFonts w:asciiTheme="majorBidi" w:eastAsiaTheme="minorEastAsia" w:hAnsiTheme="majorBidi" w:cstheme="majorBidi"/>
@@ -21653,7 +21121,6 @@
               </w:rPr>
               <w:t>B_controls+DT+HEXACO</w:t>
             </w:r>
-            <w:proofErr w:type="spellEnd"/>
           </w:p>
         </w:tc>
         <w:tc>
@@ -21852,7 +21319,6 @@
                 <w:lang w:val="en-US"/>
               </w:rPr>
             </w:pPr>
-            <w:proofErr w:type="spellStart"/>
             <w:r>
               <w:rPr>
                 <w:rFonts w:asciiTheme="majorBidi" w:eastAsiaTheme="minorEastAsia" w:hAnsiTheme="majorBidi" w:cstheme="majorBidi"/>
@@ -21862,7 +21328,6 @@
               </w:rPr>
               <w:t>B_controls+DT+HEXACO</w:t>
             </w:r>
-            <w:proofErr w:type="spellEnd"/>
           </w:p>
         </w:tc>
         <w:tc>
@@ -22061,7 +21526,6 @@
                 <w:lang w:val="en-US"/>
               </w:rPr>
             </w:pPr>
-            <w:proofErr w:type="spellStart"/>
             <w:r>
               <w:rPr>
                 <w:rFonts w:asciiTheme="majorBidi" w:eastAsiaTheme="minorEastAsia" w:hAnsiTheme="majorBidi" w:cstheme="majorBidi"/>
@@ -22071,7 +21535,6 @@
               </w:rPr>
               <w:t>B_controls+DT+HEXACO</w:t>
             </w:r>
-            <w:proofErr w:type="spellEnd"/>
           </w:p>
         </w:tc>
         <w:tc>
@@ -22274,45 +21737,14 @@
                 <w:lang w:val="en-US"/>
               </w:rPr>
             </w:pPr>
-            <w:proofErr w:type="spellStart"/>
-            <w:r>
-              <w:rPr>
-                <w:rFonts w:asciiTheme="majorBidi" w:eastAsiaTheme="minorEastAsia" w:hAnsiTheme="majorBidi" w:cstheme="majorBidi"/>
-                <w:sz w:val="21"/>
-                <w:szCs w:val="21"/>
-                <w:lang w:val="en-US"/>
-              </w:rPr>
-              <w:t>B_sensitivity</w:t>
-            </w:r>
-            <w:proofErr w:type="spellEnd"/>
-            <w:r>
-              <w:rPr>
-                <w:rFonts w:asciiTheme="majorBidi" w:eastAsiaTheme="minorEastAsia" w:hAnsiTheme="majorBidi" w:cstheme="majorBidi"/>
-                <w:sz w:val="21"/>
-                <w:szCs w:val="21"/>
-                <w:lang w:val="en-US"/>
-              </w:rPr>
-              <w:t>_(</w:t>
-            </w:r>
-            <w:proofErr w:type="spellStart"/>
-            <w:r>
-              <w:rPr>
-                <w:rFonts w:asciiTheme="majorBidi" w:eastAsiaTheme="minorEastAsia" w:hAnsiTheme="majorBidi" w:cstheme="majorBidi"/>
-                <w:sz w:val="21"/>
-                <w:szCs w:val="21"/>
-                <w:lang w:val="en-US"/>
-              </w:rPr>
-              <w:t>drop_high_Cooks</w:t>
-            </w:r>
-            <w:proofErr w:type="spellEnd"/>
-            <w:r>
-              <w:rPr>
-                <w:rFonts w:asciiTheme="majorBidi" w:eastAsiaTheme="minorEastAsia" w:hAnsiTheme="majorBidi" w:cstheme="majorBidi"/>
-                <w:sz w:val="21"/>
-                <w:szCs w:val="21"/>
-                <w:lang w:val="en-US"/>
-              </w:rPr>
-              <w:t>)</w:t>
+            <w:r>
+              <w:rPr>
+                <w:rFonts w:asciiTheme="majorBidi" w:eastAsiaTheme="minorEastAsia" w:hAnsiTheme="majorBidi" w:cstheme="majorBidi"/>
+                <w:sz w:val="21"/>
+                <w:szCs w:val="21"/>
+                <w:lang w:val="en-US"/>
+              </w:rPr>
+              <w:t>B_sensitivity_(drop_high_Cooks)</w:t>
             </w:r>
           </w:p>
         </w:tc>
@@ -22516,45 +21948,14 @@
                 <w:lang w:val="en-US"/>
               </w:rPr>
             </w:pPr>
-            <w:proofErr w:type="spellStart"/>
-            <w:r>
-              <w:rPr>
-                <w:rFonts w:asciiTheme="majorBidi" w:eastAsiaTheme="minorEastAsia" w:hAnsiTheme="majorBidi" w:cstheme="majorBidi"/>
-                <w:sz w:val="21"/>
-                <w:szCs w:val="21"/>
-                <w:lang w:val="en-US"/>
-              </w:rPr>
-              <w:t>B_sensitivity</w:t>
-            </w:r>
-            <w:proofErr w:type="spellEnd"/>
-            <w:r>
-              <w:rPr>
-                <w:rFonts w:asciiTheme="majorBidi" w:eastAsiaTheme="minorEastAsia" w:hAnsiTheme="majorBidi" w:cstheme="majorBidi"/>
-                <w:sz w:val="21"/>
-                <w:szCs w:val="21"/>
-                <w:lang w:val="en-US"/>
-              </w:rPr>
-              <w:t>_(</w:t>
-            </w:r>
-            <w:proofErr w:type="spellStart"/>
-            <w:r>
-              <w:rPr>
-                <w:rFonts w:asciiTheme="majorBidi" w:eastAsiaTheme="minorEastAsia" w:hAnsiTheme="majorBidi" w:cstheme="majorBidi"/>
-                <w:sz w:val="21"/>
-                <w:szCs w:val="21"/>
-                <w:lang w:val="en-US"/>
-              </w:rPr>
-              <w:t>drop_high_Cooks</w:t>
-            </w:r>
-            <w:proofErr w:type="spellEnd"/>
-            <w:r>
-              <w:rPr>
-                <w:rFonts w:asciiTheme="majorBidi" w:eastAsiaTheme="minorEastAsia" w:hAnsiTheme="majorBidi" w:cstheme="majorBidi"/>
-                <w:sz w:val="21"/>
-                <w:szCs w:val="21"/>
-                <w:lang w:val="en-US"/>
-              </w:rPr>
-              <w:t>)</w:t>
+            <w:r>
+              <w:rPr>
+                <w:rFonts w:asciiTheme="majorBidi" w:eastAsiaTheme="minorEastAsia" w:hAnsiTheme="majorBidi" w:cstheme="majorBidi"/>
+                <w:sz w:val="21"/>
+                <w:szCs w:val="21"/>
+                <w:lang w:val="en-US"/>
+              </w:rPr>
+              <w:t>B_sensitivity_(drop_high_Cooks)</w:t>
             </w:r>
           </w:p>
         </w:tc>
@@ -22758,45 +22159,14 @@
                 <w:lang w:val="en-US"/>
               </w:rPr>
             </w:pPr>
-            <w:proofErr w:type="spellStart"/>
-            <w:r>
-              <w:rPr>
-                <w:rFonts w:asciiTheme="majorBidi" w:eastAsiaTheme="minorEastAsia" w:hAnsiTheme="majorBidi" w:cstheme="majorBidi"/>
-                <w:sz w:val="21"/>
-                <w:szCs w:val="21"/>
-                <w:lang w:val="en-US"/>
-              </w:rPr>
-              <w:t>B_sensitivity</w:t>
-            </w:r>
-            <w:proofErr w:type="spellEnd"/>
-            <w:r>
-              <w:rPr>
-                <w:rFonts w:asciiTheme="majorBidi" w:eastAsiaTheme="minorEastAsia" w:hAnsiTheme="majorBidi" w:cstheme="majorBidi"/>
-                <w:sz w:val="21"/>
-                <w:szCs w:val="21"/>
-                <w:lang w:val="en-US"/>
-              </w:rPr>
-              <w:t>_(</w:t>
-            </w:r>
-            <w:proofErr w:type="spellStart"/>
-            <w:r>
-              <w:rPr>
-                <w:rFonts w:asciiTheme="majorBidi" w:eastAsiaTheme="minorEastAsia" w:hAnsiTheme="majorBidi" w:cstheme="majorBidi"/>
-                <w:sz w:val="21"/>
-                <w:szCs w:val="21"/>
-                <w:lang w:val="en-US"/>
-              </w:rPr>
-              <w:t>drop_high_Cooks</w:t>
-            </w:r>
-            <w:proofErr w:type="spellEnd"/>
-            <w:r>
-              <w:rPr>
-                <w:rFonts w:asciiTheme="majorBidi" w:eastAsiaTheme="minorEastAsia" w:hAnsiTheme="majorBidi" w:cstheme="majorBidi"/>
-                <w:sz w:val="21"/>
-                <w:szCs w:val="21"/>
-                <w:lang w:val="en-US"/>
-              </w:rPr>
-              <w:t>)</w:t>
+            <w:r>
+              <w:rPr>
+                <w:rFonts w:asciiTheme="majorBidi" w:eastAsiaTheme="minorEastAsia" w:hAnsiTheme="majorBidi" w:cstheme="majorBidi"/>
+                <w:sz w:val="21"/>
+                <w:szCs w:val="21"/>
+                <w:lang w:val="en-US"/>
+              </w:rPr>
+              <w:t>B_sensitivity_(drop_high_Cooks)</w:t>
             </w:r>
           </w:p>
         </w:tc>
@@ -23000,45 +22370,14 @@
                 <w:lang w:val="en-US"/>
               </w:rPr>
             </w:pPr>
-            <w:proofErr w:type="spellStart"/>
-            <w:r>
-              <w:rPr>
-                <w:rFonts w:asciiTheme="majorBidi" w:eastAsiaTheme="minorEastAsia" w:hAnsiTheme="majorBidi" w:cstheme="majorBidi"/>
-                <w:sz w:val="21"/>
-                <w:szCs w:val="21"/>
-                <w:lang w:val="en-US"/>
-              </w:rPr>
-              <w:t>B_sensitivity</w:t>
-            </w:r>
-            <w:proofErr w:type="spellEnd"/>
-            <w:r>
-              <w:rPr>
-                <w:rFonts w:asciiTheme="majorBidi" w:eastAsiaTheme="minorEastAsia" w:hAnsiTheme="majorBidi" w:cstheme="majorBidi"/>
-                <w:sz w:val="21"/>
-                <w:szCs w:val="21"/>
-                <w:lang w:val="en-US"/>
-              </w:rPr>
-              <w:t>_(</w:t>
-            </w:r>
-            <w:proofErr w:type="spellStart"/>
-            <w:r>
-              <w:rPr>
-                <w:rFonts w:asciiTheme="majorBidi" w:eastAsiaTheme="minorEastAsia" w:hAnsiTheme="majorBidi" w:cstheme="majorBidi"/>
-                <w:sz w:val="21"/>
-                <w:szCs w:val="21"/>
-                <w:lang w:val="en-US"/>
-              </w:rPr>
-              <w:t>drop_high_Cooks</w:t>
-            </w:r>
-            <w:proofErr w:type="spellEnd"/>
-            <w:r>
-              <w:rPr>
-                <w:rFonts w:asciiTheme="majorBidi" w:eastAsiaTheme="minorEastAsia" w:hAnsiTheme="majorBidi" w:cstheme="majorBidi"/>
-                <w:sz w:val="21"/>
-                <w:szCs w:val="21"/>
-                <w:lang w:val="en-US"/>
-              </w:rPr>
-              <w:t>)</w:t>
+            <w:r>
+              <w:rPr>
+                <w:rFonts w:asciiTheme="majorBidi" w:eastAsiaTheme="minorEastAsia" w:hAnsiTheme="majorBidi" w:cstheme="majorBidi"/>
+                <w:sz w:val="21"/>
+                <w:szCs w:val="21"/>
+                <w:lang w:val="en-US"/>
+              </w:rPr>
+              <w:t>B_sensitivity_(drop_high_Cooks)</w:t>
             </w:r>
           </w:p>
         </w:tc>
@@ -23242,45 +22581,14 @@
                 <w:lang w:val="en-US"/>
               </w:rPr>
             </w:pPr>
-            <w:proofErr w:type="spellStart"/>
-            <w:r>
-              <w:rPr>
-                <w:rFonts w:asciiTheme="majorBidi" w:eastAsiaTheme="minorEastAsia" w:hAnsiTheme="majorBidi" w:cstheme="majorBidi"/>
-                <w:sz w:val="21"/>
-                <w:szCs w:val="21"/>
-                <w:lang w:val="en-US"/>
-              </w:rPr>
-              <w:t>B_sensitivity</w:t>
-            </w:r>
-            <w:proofErr w:type="spellEnd"/>
-            <w:r>
-              <w:rPr>
-                <w:rFonts w:asciiTheme="majorBidi" w:eastAsiaTheme="minorEastAsia" w:hAnsiTheme="majorBidi" w:cstheme="majorBidi"/>
-                <w:sz w:val="21"/>
-                <w:szCs w:val="21"/>
-                <w:lang w:val="en-US"/>
-              </w:rPr>
-              <w:t>_(</w:t>
-            </w:r>
-            <w:proofErr w:type="spellStart"/>
-            <w:r>
-              <w:rPr>
-                <w:rFonts w:asciiTheme="majorBidi" w:eastAsiaTheme="minorEastAsia" w:hAnsiTheme="majorBidi" w:cstheme="majorBidi"/>
-                <w:sz w:val="21"/>
-                <w:szCs w:val="21"/>
-                <w:lang w:val="en-US"/>
-              </w:rPr>
-              <w:t>drop_high_Cooks</w:t>
-            </w:r>
-            <w:proofErr w:type="spellEnd"/>
-            <w:r>
-              <w:rPr>
-                <w:rFonts w:asciiTheme="majorBidi" w:eastAsiaTheme="minorEastAsia" w:hAnsiTheme="majorBidi" w:cstheme="majorBidi"/>
-                <w:sz w:val="21"/>
-                <w:szCs w:val="21"/>
-                <w:lang w:val="en-US"/>
-              </w:rPr>
-              <w:t>)</w:t>
+            <w:r>
+              <w:rPr>
+                <w:rFonts w:asciiTheme="majorBidi" w:eastAsiaTheme="minorEastAsia" w:hAnsiTheme="majorBidi" w:cstheme="majorBidi"/>
+                <w:sz w:val="21"/>
+                <w:szCs w:val="21"/>
+                <w:lang w:val="en-US"/>
+              </w:rPr>
+              <w:t>B_sensitivity_(drop_high_Cooks)</w:t>
             </w:r>
           </w:p>
         </w:tc>
@@ -23486,45 +22794,14 @@
                 <w:lang w:val="en-US"/>
               </w:rPr>
             </w:pPr>
-            <w:proofErr w:type="spellStart"/>
-            <w:r>
-              <w:rPr>
-                <w:rFonts w:asciiTheme="majorBidi" w:eastAsiaTheme="minorEastAsia" w:hAnsiTheme="majorBidi" w:cstheme="majorBidi"/>
-                <w:sz w:val="21"/>
-                <w:szCs w:val="21"/>
-                <w:lang w:val="en-US"/>
-              </w:rPr>
-              <w:t>B_sensitivity</w:t>
-            </w:r>
-            <w:proofErr w:type="spellEnd"/>
-            <w:r>
-              <w:rPr>
-                <w:rFonts w:asciiTheme="majorBidi" w:eastAsiaTheme="minorEastAsia" w:hAnsiTheme="majorBidi" w:cstheme="majorBidi"/>
-                <w:sz w:val="21"/>
-                <w:szCs w:val="21"/>
-                <w:lang w:val="en-US"/>
-              </w:rPr>
-              <w:t>_(</w:t>
-            </w:r>
-            <w:proofErr w:type="spellStart"/>
-            <w:r>
-              <w:rPr>
-                <w:rFonts w:asciiTheme="majorBidi" w:eastAsiaTheme="minorEastAsia" w:hAnsiTheme="majorBidi" w:cstheme="majorBidi"/>
-                <w:sz w:val="21"/>
-                <w:szCs w:val="21"/>
-                <w:lang w:val="en-US"/>
-              </w:rPr>
-              <w:t>drop_high_Cooks</w:t>
-            </w:r>
-            <w:proofErr w:type="spellEnd"/>
-            <w:r>
-              <w:rPr>
-                <w:rFonts w:asciiTheme="majorBidi" w:eastAsiaTheme="minorEastAsia" w:hAnsiTheme="majorBidi" w:cstheme="majorBidi"/>
-                <w:sz w:val="21"/>
-                <w:szCs w:val="21"/>
-                <w:lang w:val="en-US"/>
-              </w:rPr>
-              <w:t>)</w:t>
+            <w:r>
+              <w:rPr>
+                <w:rFonts w:asciiTheme="majorBidi" w:eastAsiaTheme="minorEastAsia" w:hAnsiTheme="majorBidi" w:cstheme="majorBidi"/>
+                <w:sz w:val="21"/>
+                <w:szCs w:val="21"/>
+                <w:lang w:val="en-US"/>
+              </w:rPr>
+              <w:t>B_sensitivity_(drop_high_Cooks)</w:t>
             </w:r>
           </w:p>
         </w:tc>
@@ -23711,47 +22988,7 @@
                 <w:szCs w:val="21"/>
                 <w:lang w:val="en-US"/>
               </w:rPr>
-              <w:t xml:space="preserve">Model B = controls (age, gender, region) + Dark Triad (M, N, P) + HEXACO (H–H, E, X, A, C, O). Internal labels: </w:t>
-            </w:r>
-            <w:proofErr w:type="spellStart"/>
-            <w:r>
-              <w:rPr>
-                <w:rFonts w:asciiTheme="majorBidi" w:eastAsiaTheme="minorEastAsia" w:hAnsiTheme="majorBidi" w:cstheme="majorBidi"/>
-                <w:sz w:val="21"/>
-                <w:szCs w:val="21"/>
-                <w:lang w:val="en-US"/>
-              </w:rPr>
-              <w:t>B_controls+DT+HEXACO</w:t>
-            </w:r>
-            <w:proofErr w:type="spellEnd"/>
-            <w:r>
-              <w:rPr>
-                <w:rFonts w:asciiTheme="majorBidi" w:eastAsiaTheme="minorEastAsia" w:hAnsiTheme="majorBidi" w:cstheme="majorBidi"/>
-                <w:sz w:val="21"/>
-                <w:szCs w:val="21"/>
-                <w:lang w:val="en-US"/>
-              </w:rPr>
-              <w:t xml:space="preserve"> = Model B (overall); </w:t>
-            </w:r>
-            <w:proofErr w:type="spellStart"/>
-            <w:r>
-              <w:rPr>
-                <w:rFonts w:asciiTheme="majorBidi" w:eastAsiaTheme="minorEastAsia" w:hAnsiTheme="majorBidi" w:cstheme="majorBidi"/>
-                <w:sz w:val="21"/>
-                <w:szCs w:val="21"/>
-                <w:lang w:val="en-US"/>
-              </w:rPr>
-              <w:t>B_by_gender</w:t>
-            </w:r>
-            <w:proofErr w:type="spellEnd"/>
-            <w:r>
-              <w:rPr>
-                <w:rFonts w:asciiTheme="majorBidi" w:eastAsiaTheme="minorEastAsia" w:hAnsiTheme="majorBidi" w:cstheme="majorBidi"/>
-                <w:sz w:val="21"/>
-                <w:szCs w:val="21"/>
-                <w:lang w:val="en-US"/>
-              </w:rPr>
-              <w:t xml:space="preserve"> = Model B estimated separately by gender. Standardized β; HC3 robust SE; two-tailed tests; *** </w:t>
+              <w:t xml:space="preserve">Model B = controls (age, gender, region) + Dark Triad (M, N, P) + HEXACO (H–H, E, X, A, C, O). Internal labels: B_controls+DT+HEXACO = Model B (overall); B_by_gender = Model B estimated separately by gender. Standardized β; HC3 robust SE; two-tailed tests; *** </w:t>
             </w:r>
             <w:r>
               <w:rPr>
@@ -24146,45 +23383,14 @@
                 <w:lang w:val="en-US"/>
               </w:rPr>
             </w:pPr>
-            <w:proofErr w:type="spellStart"/>
-            <w:r>
-              <w:rPr>
-                <w:rFonts w:asciiTheme="majorBidi" w:eastAsiaTheme="minorEastAsia" w:hAnsiTheme="majorBidi" w:cstheme="majorBidi"/>
-                <w:sz w:val="21"/>
-                <w:szCs w:val="21"/>
-                <w:lang w:val="en-US"/>
-              </w:rPr>
-              <w:t>B_sensitivity</w:t>
-            </w:r>
-            <w:proofErr w:type="spellEnd"/>
-            <w:r>
-              <w:rPr>
-                <w:rFonts w:asciiTheme="majorBidi" w:eastAsiaTheme="minorEastAsia" w:hAnsiTheme="majorBidi" w:cstheme="majorBidi"/>
-                <w:sz w:val="21"/>
-                <w:szCs w:val="21"/>
-                <w:lang w:val="en-US"/>
-              </w:rPr>
-              <w:t>_(</w:t>
-            </w:r>
-            <w:proofErr w:type="spellStart"/>
-            <w:r>
-              <w:rPr>
-                <w:rFonts w:asciiTheme="majorBidi" w:eastAsiaTheme="minorEastAsia" w:hAnsiTheme="majorBidi" w:cstheme="majorBidi"/>
-                <w:sz w:val="21"/>
-                <w:szCs w:val="21"/>
-                <w:lang w:val="en-US"/>
-              </w:rPr>
-              <w:t>drop_high_Cooks</w:t>
-            </w:r>
-            <w:proofErr w:type="spellEnd"/>
-            <w:r>
-              <w:rPr>
-                <w:rFonts w:asciiTheme="majorBidi" w:eastAsiaTheme="minorEastAsia" w:hAnsiTheme="majorBidi" w:cstheme="majorBidi"/>
-                <w:sz w:val="21"/>
-                <w:szCs w:val="21"/>
-                <w:lang w:val="en-US"/>
-              </w:rPr>
-              <w:t>)</w:t>
+            <w:r>
+              <w:rPr>
+                <w:rFonts w:asciiTheme="majorBidi" w:eastAsiaTheme="minorEastAsia" w:hAnsiTheme="majorBidi" w:cstheme="majorBidi"/>
+                <w:sz w:val="21"/>
+                <w:szCs w:val="21"/>
+                <w:lang w:val="en-US"/>
+              </w:rPr>
+              <w:t>B_sensitivity_(drop_high_Cooks)</w:t>
             </w:r>
           </w:p>
         </w:tc>
@@ -24388,45 +23594,14 @@
                 <w:lang w:val="en-US"/>
               </w:rPr>
             </w:pPr>
-            <w:proofErr w:type="spellStart"/>
-            <w:r>
-              <w:rPr>
-                <w:rFonts w:asciiTheme="majorBidi" w:eastAsiaTheme="minorEastAsia" w:hAnsiTheme="majorBidi" w:cstheme="majorBidi"/>
-                <w:sz w:val="21"/>
-                <w:szCs w:val="21"/>
-                <w:lang w:val="en-US"/>
-              </w:rPr>
-              <w:t>B_sensitivity</w:t>
-            </w:r>
-            <w:proofErr w:type="spellEnd"/>
-            <w:r>
-              <w:rPr>
-                <w:rFonts w:asciiTheme="majorBidi" w:eastAsiaTheme="minorEastAsia" w:hAnsiTheme="majorBidi" w:cstheme="majorBidi"/>
-                <w:sz w:val="21"/>
-                <w:szCs w:val="21"/>
-                <w:lang w:val="en-US"/>
-              </w:rPr>
-              <w:t>_(</w:t>
-            </w:r>
-            <w:proofErr w:type="spellStart"/>
-            <w:r>
-              <w:rPr>
-                <w:rFonts w:asciiTheme="majorBidi" w:eastAsiaTheme="minorEastAsia" w:hAnsiTheme="majorBidi" w:cstheme="majorBidi"/>
-                <w:sz w:val="21"/>
-                <w:szCs w:val="21"/>
-                <w:lang w:val="en-US"/>
-              </w:rPr>
-              <w:t>drop_high_Cooks</w:t>
-            </w:r>
-            <w:proofErr w:type="spellEnd"/>
-            <w:r>
-              <w:rPr>
-                <w:rFonts w:asciiTheme="majorBidi" w:eastAsiaTheme="minorEastAsia" w:hAnsiTheme="majorBidi" w:cstheme="majorBidi"/>
-                <w:sz w:val="21"/>
-                <w:szCs w:val="21"/>
-                <w:lang w:val="en-US"/>
-              </w:rPr>
-              <w:t>)</w:t>
+            <w:r>
+              <w:rPr>
+                <w:rFonts w:asciiTheme="majorBidi" w:eastAsiaTheme="minorEastAsia" w:hAnsiTheme="majorBidi" w:cstheme="majorBidi"/>
+                <w:sz w:val="21"/>
+                <w:szCs w:val="21"/>
+                <w:lang w:val="en-US"/>
+              </w:rPr>
+              <w:t>B_sensitivity_(drop_high_Cooks)</w:t>
             </w:r>
           </w:p>
         </w:tc>
@@ -24626,45 +23801,14 @@
                 <w:lang w:val="en-US"/>
               </w:rPr>
             </w:pPr>
-            <w:proofErr w:type="spellStart"/>
-            <w:r>
-              <w:rPr>
-                <w:rFonts w:asciiTheme="majorBidi" w:eastAsiaTheme="minorEastAsia" w:hAnsiTheme="majorBidi" w:cstheme="majorBidi"/>
-                <w:sz w:val="21"/>
-                <w:szCs w:val="21"/>
-                <w:lang w:val="en-US"/>
-              </w:rPr>
-              <w:t>B_sensitivity</w:t>
-            </w:r>
-            <w:proofErr w:type="spellEnd"/>
-            <w:r>
-              <w:rPr>
-                <w:rFonts w:asciiTheme="majorBidi" w:eastAsiaTheme="minorEastAsia" w:hAnsiTheme="majorBidi" w:cstheme="majorBidi"/>
-                <w:sz w:val="21"/>
-                <w:szCs w:val="21"/>
-                <w:lang w:val="en-US"/>
-              </w:rPr>
-              <w:t>_(</w:t>
-            </w:r>
-            <w:proofErr w:type="spellStart"/>
-            <w:r>
-              <w:rPr>
-                <w:rFonts w:asciiTheme="majorBidi" w:eastAsiaTheme="minorEastAsia" w:hAnsiTheme="majorBidi" w:cstheme="majorBidi"/>
-                <w:sz w:val="21"/>
-                <w:szCs w:val="21"/>
-                <w:lang w:val="en-US"/>
-              </w:rPr>
-              <w:t>drop_high_Cooks</w:t>
-            </w:r>
-            <w:proofErr w:type="spellEnd"/>
-            <w:r>
-              <w:rPr>
-                <w:rFonts w:asciiTheme="majorBidi" w:eastAsiaTheme="minorEastAsia" w:hAnsiTheme="majorBidi" w:cstheme="majorBidi"/>
-                <w:sz w:val="21"/>
-                <w:szCs w:val="21"/>
-                <w:lang w:val="en-US"/>
-              </w:rPr>
-              <w:t>)</w:t>
+            <w:r>
+              <w:rPr>
+                <w:rFonts w:asciiTheme="majorBidi" w:eastAsiaTheme="minorEastAsia" w:hAnsiTheme="majorBidi" w:cstheme="majorBidi"/>
+                <w:sz w:val="21"/>
+                <w:szCs w:val="21"/>
+                <w:lang w:val="en-US"/>
+              </w:rPr>
+              <w:t>B_sensitivity_(drop_high_Cooks)</w:t>
             </w:r>
           </w:p>
         </w:tc>
@@ -24868,7 +24012,6 @@
                 <w:lang w:val="en-US"/>
               </w:rPr>
             </w:pPr>
-            <w:proofErr w:type="spellStart"/>
             <w:r>
               <w:rPr>
                 <w:rFonts w:asciiTheme="majorBidi" w:eastAsiaTheme="minorEastAsia" w:hAnsiTheme="majorBidi" w:cstheme="majorBidi"/>
@@ -24878,7 +24021,6 @@
               </w:rPr>
               <w:t>C_controls+DT+HEXACO+DTxHH</w:t>
             </w:r>
-            <w:proofErr w:type="spellEnd"/>
           </w:p>
         </w:tc>
         <w:tc>
@@ -25081,7 +24223,6 @@
                 <w:lang w:val="en-US"/>
               </w:rPr>
             </w:pPr>
-            <w:proofErr w:type="spellStart"/>
             <w:r>
               <w:rPr>
                 <w:rFonts w:asciiTheme="majorBidi" w:eastAsiaTheme="minorEastAsia" w:hAnsiTheme="majorBidi" w:cstheme="majorBidi"/>
@@ -25091,7 +24232,6 @@
               </w:rPr>
               <w:t>C_controls+DT+HEXACO+DTxHH</w:t>
             </w:r>
-            <w:proofErr w:type="spellEnd"/>
           </w:p>
         </w:tc>
         <w:tc>
@@ -25294,7 +24434,6 @@
                 <w:lang w:val="en-US"/>
               </w:rPr>
             </w:pPr>
-            <w:proofErr w:type="spellStart"/>
             <w:r>
               <w:rPr>
                 <w:rFonts w:asciiTheme="majorBidi" w:eastAsiaTheme="minorEastAsia" w:hAnsiTheme="majorBidi" w:cstheme="majorBidi"/>
@@ -25304,7 +24443,6 @@
               </w:rPr>
               <w:t>C_controls+DT+HEXACO+DTxHH</w:t>
             </w:r>
-            <w:proofErr w:type="spellEnd"/>
           </w:p>
         </w:tc>
         <w:tc>
@@ -25507,7 +24645,6 @@
                 <w:lang w:val="en-US"/>
               </w:rPr>
             </w:pPr>
-            <w:proofErr w:type="spellStart"/>
             <w:r>
               <w:rPr>
                 <w:rFonts w:asciiTheme="majorBidi" w:eastAsiaTheme="minorEastAsia" w:hAnsiTheme="majorBidi" w:cstheme="majorBidi"/>
@@ -25517,7 +24654,6 @@
               </w:rPr>
               <w:t>C_controls+DT+HEXACO+DTxHH</w:t>
             </w:r>
-            <w:proofErr w:type="spellEnd"/>
           </w:p>
         </w:tc>
         <w:tc>
@@ -25720,7 +24856,6 @@
                 <w:lang w:val="en-US"/>
               </w:rPr>
             </w:pPr>
-            <w:proofErr w:type="spellStart"/>
             <w:r>
               <w:rPr>
                 <w:rFonts w:asciiTheme="majorBidi" w:eastAsiaTheme="minorEastAsia" w:hAnsiTheme="majorBidi" w:cstheme="majorBidi"/>
@@ -25730,7 +24865,6 @@
               </w:rPr>
               <w:t>C_controls+DT+HEXACO+DTxHH</w:t>
             </w:r>
-            <w:proofErr w:type="spellEnd"/>
           </w:p>
         </w:tc>
         <w:tc>
@@ -25929,7 +25063,6 @@
                 <w:lang w:val="en-US"/>
               </w:rPr>
             </w:pPr>
-            <w:proofErr w:type="spellStart"/>
             <w:r>
               <w:rPr>
                 <w:rFonts w:asciiTheme="majorBidi" w:eastAsiaTheme="minorEastAsia" w:hAnsiTheme="majorBidi" w:cstheme="majorBidi"/>
@@ -25939,7 +25072,6 @@
               </w:rPr>
               <w:t>C_controls+DT+HEXACO+DTxHH</w:t>
             </w:r>
-            <w:proofErr w:type="spellEnd"/>
           </w:p>
         </w:tc>
         <w:tc>
@@ -26138,7 +25270,6 @@
                 <w:lang w:val="en-US"/>
               </w:rPr>
             </w:pPr>
-            <w:proofErr w:type="spellStart"/>
             <w:r>
               <w:rPr>
                 <w:rFonts w:asciiTheme="majorBidi" w:eastAsiaTheme="minorEastAsia" w:hAnsiTheme="majorBidi" w:cstheme="majorBidi"/>
@@ -26148,7 +25279,6 @@
               </w:rPr>
               <w:t>C_controls+DT+HEXACO+DTxHH</w:t>
             </w:r>
-            <w:proofErr w:type="spellEnd"/>
           </w:p>
         </w:tc>
         <w:tc>
@@ -26351,7 +25481,6 @@
                 <w:lang w:val="en-US"/>
               </w:rPr>
             </w:pPr>
-            <w:proofErr w:type="spellStart"/>
             <w:r>
               <w:rPr>
                 <w:rFonts w:asciiTheme="majorBidi" w:eastAsiaTheme="minorEastAsia" w:hAnsiTheme="majorBidi" w:cstheme="majorBidi"/>
@@ -26361,7 +25490,6 @@
               </w:rPr>
               <w:t>C_controls+DT+HEXACO+DTxHH</w:t>
             </w:r>
-            <w:proofErr w:type="spellEnd"/>
           </w:p>
         </w:tc>
         <w:tc>
@@ -26560,7 +25688,6 @@
                 <w:lang w:val="en-US"/>
               </w:rPr>
             </w:pPr>
-            <w:proofErr w:type="spellStart"/>
             <w:r>
               <w:rPr>
                 <w:rFonts w:asciiTheme="majorBidi" w:eastAsiaTheme="minorEastAsia" w:hAnsiTheme="majorBidi" w:cstheme="majorBidi"/>
@@ -26570,7 +25697,6 @@
               </w:rPr>
               <w:t>C_controls+DT+HEXACO+DTxHH</w:t>
             </w:r>
-            <w:proofErr w:type="spellEnd"/>
           </w:p>
         </w:tc>
         <w:tc>
@@ -26773,7 +25899,6 @@
                 <w:lang w:val="en-US"/>
               </w:rPr>
             </w:pPr>
-            <w:proofErr w:type="spellStart"/>
             <w:r>
               <w:rPr>
                 <w:rFonts w:asciiTheme="majorBidi" w:eastAsiaTheme="minorEastAsia" w:hAnsiTheme="majorBidi" w:cstheme="majorBidi"/>
@@ -26783,7 +25908,6 @@
               </w:rPr>
               <w:t>B_by_gender</w:t>
             </w:r>
-            <w:proofErr w:type="spellEnd"/>
           </w:p>
         </w:tc>
         <w:tc>
@@ -26982,7 +26106,6 @@
                 <w:lang w:val="en-US"/>
               </w:rPr>
             </w:pPr>
-            <w:proofErr w:type="spellStart"/>
             <w:r>
               <w:rPr>
                 <w:rFonts w:asciiTheme="majorBidi" w:eastAsiaTheme="minorEastAsia" w:hAnsiTheme="majorBidi" w:cstheme="majorBidi"/>
@@ -26992,7 +26115,6 @@
               </w:rPr>
               <w:t>B_by_gender</w:t>
             </w:r>
-            <w:proofErr w:type="spellEnd"/>
           </w:p>
         </w:tc>
         <w:tc>
@@ -27191,7 +26313,6 @@
                 <w:lang w:val="en-US"/>
               </w:rPr>
             </w:pPr>
-            <w:proofErr w:type="spellStart"/>
             <w:r>
               <w:rPr>
                 <w:rFonts w:asciiTheme="majorBidi" w:eastAsiaTheme="minorEastAsia" w:hAnsiTheme="majorBidi" w:cstheme="majorBidi"/>
@@ -27201,7 +26322,6 @@
               </w:rPr>
               <w:t>B_by_gender</w:t>
             </w:r>
-            <w:proofErr w:type="spellEnd"/>
           </w:p>
         </w:tc>
         <w:tc>
@@ -27404,7 +26524,6 @@
                 <w:lang w:val="en-US"/>
               </w:rPr>
             </w:pPr>
-            <w:proofErr w:type="spellStart"/>
             <w:r>
               <w:rPr>
                 <w:rFonts w:asciiTheme="majorBidi" w:eastAsiaTheme="minorEastAsia" w:hAnsiTheme="majorBidi" w:cstheme="majorBidi"/>
@@ -27414,7 +26533,6 @@
               </w:rPr>
               <w:t>B_by_gender</w:t>
             </w:r>
-            <w:proofErr w:type="spellEnd"/>
           </w:p>
         </w:tc>
         <w:tc>
@@ -27613,7 +26731,6 @@
                 <w:lang w:val="en-US"/>
               </w:rPr>
             </w:pPr>
-            <w:proofErr w:type="spellStart"/>
             <w:r>
               <w:rPr>
                 <w:rFonts w:asciiTheme="majorBidi" w:eastAsiaTheme="minorEastAsia" w:hAnsiTheme="majorBidi" w:cstheme="majorBidi"/>
@@ -27623,7 +26740,6 @@
               </w:rPr>
               <w:t>B_by_gender</w:t>
             </w:r>
-            <w:proofErr w:type="spellEnd"/>
           </w:p>
         </w:tc>
         <w:tc>
@@ -27828,7 +26944,6 @@
                 <w:lang w:val="en-US"/>
               </w:rPr>
             </w:pPr>
-            <w:proofErr w:type="spellStart"/>
             <w:r>
               <w:rPr>
                 <w:rFonts w:asciiTheme="majorBidi" w:eastAsiaTheme="minorEastAsia" w:hAnsiTheme="majorBidi" w:cstheme="majorBidi"/>
@@ -27838,7 +26953,6 @@
               </w:rPr>
               <w:t>B_by_gender</w:t>
             </w:r>
-            <w:proofErr w:type="spellEnd"/>
           </w:p>
         </w:tc>
         <w:tc>
@@ -28024,47 +27138,7 @@
                 <w:szCs w:val="21"/>
                 <w:lang w:val="en-US"/>
               </w:rPr>
-              <w:t xml:space="preserve">Model B = controls (age, gender, region) + Dark Triad (M, N, P) + HEXACO (H–H, E, X, A, C, O). Internal labels: </w:t>
-            </w:r>
-            <w:proofErr w:type="spellStart"/>
-            <w:r>
-              <w:rPr>
-                <w:rFonts w:asciiTheme="majorBidi" w:eastAsiaTheme="minorEastAsia" w:hAnsiTheme="majorBidi" w:cstheme="majorBidi"/>
-                <w:sz w:val="21"/>
-                <w:szCs w:val="21"/>
-                <w:lang w:val="en-US"/>
-              </w:rPr>
-              <w:t>B_controls+DT+HEXACO</w:t>
-            </w:r>
-            <w:proofErr w:type="spellEnd"/>
-            <w:r>
-              <w:rPr>
-                <w:rFonts w:asciiTheme="majorBidi" w:eastAsiaTheme="minorEastAsia" w:hAnsiTheme="majorBidi" w:cstheme="majorBidi"/>
-                <w:sz w:val="21"/>
-                <w:szCs w:val="21"/>
-                <w:lang w:val="en-US"/>
-              </w:rPr>
-              <w:t xml:space="preserve"> = Model B (overall); </w:t>
-            </w:r>
-            <w:proofErr w:type="spellStart"/>
-            <w:r>
-              <w:rPr>
-                <w:rFonts w:asciiTheme="majorBidi" w:eastAsiaTheme="minorEastAsia" w:hAnsiTheme="majorBidi" w:cstheme="majorBidi"/>
-                <w:sz w:val="21"/>
-                <w:szCs w:val="21"/>
-                <w:lang w:val="en-US"/>
-              </w:rPr>
-              <w:t>B_by_gender</w:t>
-            </w:r>
-            <w:proofErr w:type="spellEnd"/>
-            <w:r>
-              <w:rPr>
-                <w:rFonts w:asciiTheme="majorBidi" w:eastAsiaTheme="minorEastAsia" w:hAnsiTheme="majorBidi" w:cstheme="majorBidi"/>
-                <w:sz w:val="21"/>
-                <w:szCs w:val="21"/>
-                <w:lang w:val="en-US"/>
-              </w:rPr>
-              <w:t xml:space="preserve"> = Model B estimated separately by gender. Standardized β; HC3 robust SE; two-tailed tests; *** </w:t>
+              <w:t xml:space="preserve">Model B = controls (age, gender, region) + Dark Triad (M, N, P) + HEXACO (H–H, E, X, A, C, O). Internal labels: B_controls+DT+HEXACO = Model B (overall); B_by_gender = Model B estimated separately by gender. Standardized β; HC3 robust SE; two-tailed tests; *** </w:t>
             </w:r>
             <w:r>
               <w:rPr>
@@ -28459,7 +27533,6 @@
                 <w:lang w:val="en-US"/>
               </w:rPr>
             </w:pPr>
-            <w:proofErr w:type="spellStart"/>
             <w:r>
               <w:rPr>
                 <w:rFonts w:asciiTheme="majorBidi" w:eastAsiaTheme="minorEastAsia" w:hAnsiTheme="majorBidi" w:cstheme="majorBidi"/>
@@ -28469,7 +27542,6 @@
               </w:rPr>
               <w:t>B_by_gender</w:t>
             </w:r>
-            <w:proofErr w:type="spellEnd"/>
           </w:p>
         </w:tc>
         <w:tc>
@@ -28668,7 +27740,6 @@
                 <w:lang w:val="en-US"/>
               </w:rPr>
             </w:pPr>
-            <w:proofErr w:type="spellStart"/>
             <w:r>
               <w:rPr>
                 <w:rFonts w:asciiTheme="majorBidi" w:eastAsiaTheme="minorEastAsia" w:hAnsiTheme="majorBidi" w:cstheme="majorBidi"/>
@@ -28678,7 +27749,6 @@
               </w:rPr>
               <w:t>B_by_gender</w:t>
             </w:r>
-            <w:proofErr w:type="spellEnd"/>
           </w:p>
         </w:tc>
         <w:tc>
@@ -28877,7 +27947,6 @@
                 <w:lang w:val="en-US"/>
               </w:rPr>
             </w:pPr>
-            <w:proofErr w:type="spellStart"/>
             <w:r>
               <w:rPr>
                 <w:rFonts w:asciiTheme="majorBidi" w:eastAsiaTheme="minorEastAsia" w:hAnsiTheme="majorBidi" w:cstheme="majorBidi"/>
@@ -28887,7 +27956,6 @@
               </w:rPr>
               <w:t>B_by_gender</w:t>
             </w:r>
-            <w:proofErr w:type="spellEnd"/>
           </w:p>
         </w:tc>
         <w:tc>
@@ -29090,7 +28158,6 @@
                 <w:lang w:val="en-US"/>
               </w:rPr>
             </w:pPr>
-            <w:proofErr w:type="spellStart"/>
             <w:r>
               <w:rPr>
                 <w:rFonts w:asciiTheme="majorBidi" w:eastAsiaTheme="minorEastAsia" w:hAnsiTheme="majorBidi" w:cstheme="majorBidi"/>
@@ -29100,7 +28167,6 @@
               </w:rPr>
               <w:t>B_by_gender</w:t>
             </w:r>
-            <w:proofErr w:type="spellEnd"/>
           </w:p>
         </w:tc>
         <w:tc>
@@ -29303,7 +28369,6 @@
                 <w:lang w:val="en-US"/>
               </w:rPr>
             </w:pPr>
-            <w:proofErr w:type="spellStart"/>
             <w:r>
               <w:rPr>
                 <w:rFonts w:asciiTheme="majorBidi" w:eastAsiaTheme="minorEastAsia" w:hAnsiTheme="majorBidi" w:cstheme="majorBidi"/>
@@ -29313,7 +28378,6 @@
               </w:rPr>
               <w:t>B_by_gender</w:t>
             </w:r>
-            <w:proofErr w:type="spellEnd"/>
           </w:p>
         </w:tc>
         <w:tc>
@@ -29512,7 +28576,6 @@
                 <w:lang w:val="en-US"/>
               </w:rPr>
             </w:pPr>
-            <w:proofErr w:type="spellStart"/>
             <w:r>
               <w:rPr>
                 <w:rFonts w:asciiTheme="majorBidi" w:eastAsiaTheme="minorEastAsia" w:hAnsiTheme="majorBidi" w:cstheme="majorBidi"/>
@@ -29522,7 +28585,6 @@
               </w:rPr>
               <w:t>B_by_gender</w:t>
             </w:r>
-            <w:proofErr w:type="spellEnd"/>
           </w:p>
         </w:tc>
         <w:tc>
@@ -29721,7 +28783,6 @@
                 <w:lang w:val="en-US"/>
               </w:rPr>
             </w:pPr>
-            <w:proofErr w:type="spellStart"/>
             <w:r>
               <w:rPr>
                 <w:rFonts w:asciiTheme="majorBidi" w:eastAsiaTheme="minorEastAsia" w:hAnsiTheme="majorBidi" w:cstheme="majorBidi"/>
@@ -29731,7 +28792,6 @@
               </w:rPr>
               <w:t>B_by_gender</w:t>
             </w:r>
-            <w:proofErr w:type="spellEnd"/>
           </w:p>
         </w:tc>
         <w:tc>
@@ -29934,7 +28994,6 @@
                 <w:lang w:val="en-US"/>
               </w:rPr>
             </w:pPr>
-            <w:proofErr w:type="spellStart"/>
             <w:r>
               <w:rPr>
                 <w:rFonts w:asciiTheme="majorBidi" w:eastAsiaTheme="minorEastAsia" w:hAnsiTheme="majorBidi" w:cstheme="majorBidi"/>
@@ -29944,7 +29003,6 @@
               </w:rPr>
               <w:t>B_by_gender</w:t>
             </w:r>
-            <w:proofErr w:type="spellEnd"/>
           </w:p>
         </w:tc>
         <w:tc>
@@ -30143,7 +29201,6 @@
                 <w:lang w:val="en-US"/>
               </w:rPr>
             </w:pPr>
-            <w:proofErr w:type="spellStart"/>
             <w:r>
               <w:rPr>
                 <w:rFonts w:asciiTheme="majorBidi" w:eastAsiaTheme="minorEastAsia" w:hAnsiTheme="majorBidi" w:cstheme="majorBidi"/>
@@ -30153,7 +29210,6 @@
               </w:rPr>
               <w:t>B_by_gender</w:t>
             </w:r>
-            <w:proofErr w:type="spellEnd"/>
           </w:p>
         </w:tc>
         <w:tc>
@@ -30352,7 +29408,6 @@
                 <w:lang w:val="en-US"/>
               </w:rPr>
             </w:pPr>
-            <w:proofErr w:type="spellStart"/>
             <w:r>
               <w:rPr>
                 <w:rFonts w:asciiTheme="majorBidi" w:eastAsiaTheme="minorEastAsia" w:hAnsiTheme="majorBidi" w:cstheme="majorBidi"/>
@@ -30362,7 +29417,6 @@
               </w:rPr>
               <w:t>B_by_gender</w:t>
             </w:r>
-            <w:proofErr w:type="spellEnd"/>
           </w:p>
         </w:tc>
         <w:tc>
@@ -30561,7 +29615,6 @@
                 <w:lang w:val="en-US"/>
               </w:rPr>
             </w:pPr>
-            <w:proofErr w:type="spellStart"/>
             <w:r>
               <w:rPr>
                 <w:rFonts w:asciiTheme="majorBidi" w:eastAsiaTheme="minorEastAsia" w:hAnsiTheme="majorBidi" w:cstheme="majorBidi"/>
@@ -30571,7 +29624,6 @@
               </w:rPr>
               <w:t>B_by_gender</w:t>
             </w:r>
-            <w:proofErr w:type="spellEnd"/>
           </w:p>
         </w:tc>
         <w:tc>
@@ -30776,7 +29828,6 @@
                 <w:lang w:val="en-US"/>
               </w:rPr>
             </w:pPr>
-            <w:proofErr w:type="spellStart"/>
             <w:r>
               <w:rPr>
                 <w:rFonts w:asciiTheme="majorBidi" w:eastAsiaTheme="minorEastAsia" w:hAnsiTheme="majorBidi" w:cstheme="majorBidi"/>
@@ -30786,7 +29837,6 @@
               </w:rPr>
               <w:t>B_by_gender</w:t>
             </w:r>
-            <w:proofErr w:type="spellEnd"/>
           </w:p>
         </w:tc>
         <w:tc>
@@ -30972,47 +30022,7 @@
                 <w:szCs w:val="21"/>
                 <w:lang w:val="en-US"/>
               </w:rPr>
-              <w:t xml:space="preserve">Model B = controls (age, gender, region) + Dark Triad (M, N, P) + HEXACO (H–H, E, X, A, C, O). Internal labels: </w:t>
-            </w:r>
-            <w:proofErr w:type="spellStart"/>
-            <w:r>
-              <w:rPr>
-                <w:rFonts w:asciiTheme="majorBidi" w:eastAsiaTheme="minorEastAsia" w:hAnsiTheme="majorBidi" w:cstheme="majorBidi"/>
-                <w:sz w:val="21"/>
-                <w:szCs w:val="21"/>
-                <w:lang w:val="en-US"/>
-              </w:rPr>
-              <w:t>B_controls+DT+HEXACO</w:t>
-            </w:r>
-            <w:proofErr w:type="spellEnd"/>
-            <w:r>
-              <w:rPr>
-                <w:rFonts w:asciiTheme="majorBidi" w:eastAsiaTheme="minorEastAsia" w:hAnsiTheme="majorBidi" w:cstheme="majorBidi"/>
-                <w:sz w:val="21"/>
-                <w:szCs w:val="21"/>
-                <w:lang w:val="en-US"/>
-              </w:rPr>
-              <w:t xml:space="preserve"> = Model B (overall); </w:t>
-            </w:r>
-            <w:proofErr w:type="spellStart"/>
-            <w:r>
-              <w:rPr>
-                <w:rFonts w:asciiTheme="majorBidi" w:eastAsiaTheme="minorEastAsia" w:hAnsiTheme="majorBidi" w:cstheme="majorBidi"/>
-                <w:sz w:val="21"/>
-                <w:szCs w:val="21"/>
-                <w:lang w:val="en-US"/>
-              </w:rPr>
-              <w:t>B_by_gender</w:t>
-            </w:r>
-            <w:proofErr w:type="spellEnd"/>
-            <w:r>
-              <w:rPr>
-                <w:rFonts w:asciiTheme="majorBidi" w:eastAsiaTheme="minorEastAsia" w:hAnsiTheme="majorBidi" w:cstheme="majorBidi"/>
-                <w:sz w:val="21"/>
-                <w:szCs w:val="21"/>
-                <w:lang w:val="en-US"/>
-              </w:rPr>
-              <w:t xml:space="preserve"> = Model B estimated separately by gender. Standardized β; HC3 robust SE; two-tailed tests; *** </w:t>
+              <w:t xml:space="preserve">Model B = controls (age, gender, region) + Dark Triad (M, N, P) + HEXACO (H–H, E, X, A, C, O). Internal labels: B_controls+DT+HEXACO = Model B (overall); B_by_gender = Model B estimated separately by gender. Standardized β; HC3 robust SE; two-tailed tests; *** </w:t>
             </w:r>
             <w:r>
               <w:rPr>
@@ -31401,7 +30411,6 @@
                 <w:lang w:val="en-US"/>
               </w:rPr>
             </w:pPr>
-            <w:proofErr w:type="spellStart"/>
             <w:r>
               <w:rPr>
                 <w:rFonts w:asciiTheme="majorBidi" w:eastAsiaTheme="minorEastAsia" w:hAnsiTheme="majorBidi" w:cstheme="majorBidi"/>
@@ -31409,7 +30418,6 @@
               </w:rPr>
               <w:t>pΔ</w:t>
             </w:r>
-            <w:proofErr w:type="spellEnd"/>
           </w:p>
         </w:tc>
         <w:tc>
@@ -34815,7 +33823,6 @@
                 <w:lang w:val="en-US"/>
               </w:rPr>
             </w:pPr>
-            <w:proofErr w:type="spellStart"/>
             <w:r>
               <w:rPr>
                 <w:rFonts w:asciiTheme="majorBidi" w:eastAsiaTheme="minorEastAsia" w:hAnsiTheme="majorBidi" w:cstheme="majorBidi"/>
@@ -34823,7 +33830,6 @@
               </w:rPr>
               <w:t>area_simplified_Kinki</w:t>
             </w:r>
-            <w:proofErr w:type="spellEnd"/>
           </w:p>
         </w:tc>
         <w:tc>
@@ -34910,7 +33916,6 @@
                 <w:lang w:val="en-US"/>
               </w:rPr>
             </w:pPr>
-            <w:proofErr w:type="spellStart"/>
             <w:r>
               <w:rPr>
                 <w:rFonts w:asciiTheme="majorBidi" w:eastAsiaTheme="minorEastAsia" w:hAnsiTheme="majorBidi" w:cstheme="majorBidi"/>
@@ -34918,7 +33923,6 @@
               </w:rPr>
               <w:t>area_simplified_Other</w:t>
             </w:r>
-            <w:proofErr w:type="spellEnd"/>
           </w:p>
         </w:tc>
         <w:tc>
@@ -36028,7 +35032,6 @@
                 <w:lang w:val="en-US"/>
               </w:rPr>
             </w:pPr>
-            <w:proofErr w:type="spellStart"/>
             <w:r>
               <w:rPr>
                 <w:rFonts w:asciiTheme="majorBidi" w:eastAsiaTheme="minorEastAsia" w:hAnsiTheme="majorBidi" w:cstheme="majorBidi"/>
@@ -36036,7 +35039,6 @@
               </w:rPr>
               <w:t>area_simplified_Kinki</w:t>
             </w:r>
-            <w:proofErr w:type="spellEnd"/>
           </w:p>
         </w:tc>
         <w:tc>
@@ -36123,7 +35125,6 @@
                 <w:lang w:val="en-US"/>
               </w:rPr>
             </w:pPr>
-            <w:proofErr w:type="spellStart"/>
             <w:r>
               <w:rPr>
                 <w:rFonts w:asciiTheme="majorBidi" w:eastAsiaTheme="minorEastAsia" w:hAnsiTheme="majorBidi" w:cstheme="majorBidi"/>
@@ -36131,7 +35132,6 @@
               </w:rPr>
               <w:t>area_simplified_Other</w:t>
             </w:r>
-            <w:proofErr w:type="spellEnd"/>
           </w:p>
         </w:tc>
         <w:tc>
@@ -37036,7 +36036,8 @@
         <w:rPr>
           <w:b/>
         </w:rPr>
-        <w:t xml:space="preserve">Table 8</w:t>
+        <w:lastRenderedPageBreak/>
+        <w:t>Table 8</w:t>
       </w:r>
     </w:p>
     <w:p>
@@ -37044,11 +36045,12 @@
         <w:rPr>
           <w:b/>
         </w:rPr>
-        <w:t xml:space="preserve">Sex-stratified Model B coefficients (HC3-robust standardized β)</w:t>
+        <w:t>Sex-stratified Model B coefficients (HC3-robust standardized β)</w:t>
       </w:r>
     </w:p>
     <w:tbl>
       <w:tblPr>
+        <w:tblW w:w="5000" w:type="pct"/>
         <w:tblBorders>
           <w:top w:val="single" w:sz="4" w:space="0" w:color="000000"/>
           <w:left w:val="single" w:sz="4" w:space="0" w:color="000000"/>
@@ -37057,14 +36059,14 @@
           <w:insideH w:val="single" w:sz="4" w:space="0" w:color="000000"/>
           <w:insideV w:val="single" w:sz="4" w:space="0" w:color="000000"/>
         </w:tblBorders>
-        <w:tblW w:w="5000" w:type="pct"/>
+        <w:tblLook w:val="04A0" w:firstRow="1" w:lastRow="0" w:firstColumn="1" w:lastColumn="0" w:noHBand="0" w:noVBand="1"/>
       </w:tblPr>
       <w:tblGrid>
-        <w:gridCol w:w="2000"/>
-        <w:gridCol w:w="2000"/>
-        <w:gridCol w:w="2000"/>
-        <w:gridCol w:w="2000"/>
-        <w:gridCol w:w="2000"/>
+        <w:gridCol w:w="1996"/>
+        <w:gridCol w:w="1708"/>
+        <w:gridCol w:w="1708"/>
+        <w:gridCol w:w="1708"/>
+        <w:gridCol w:w="1708"/>
       </w:tblGrid>
       <w:tr>
         <w:tc>
@@ -37076,7 +36078,7 @@
               <w:rPr>
                 <w:b/>
               </w:rPr>
-              <w:t xml:space="preserve">Variable</w:t>
+              <w:t>Variable</w:t>
             </w:r>
           </w:p>
         </w:tc>
@@ -37089,7 +36091,7 @@
               <w:rPr>
                 <w:b/>
               </w:rPr>
-              <w:t xml:space="preserve">Power Harassment</w:t>
+              <w:t>Power Harassment</w:t>
             </w:r>
           </w:p>
           <w:p>
@@ -37097,7 +36099,7 @@
               <w:rPr>
                 <w:b/>
               </w:rPr>
-              <w:t xml:space="preserve">Men (n=133)</w:t>
+              <w:t>Men (n=133)</w:t>
             </w:r>
           </w:p>
         </w:tc>
@@ -37110,7 +36112,7 @@
               <w:rPr>
                 <w:b/>
               </w:rPr>
-              <w:t xml:space="preserve">Power Harassment</w:t>
+              <w:t>Power Harassment</w:t>
             </w:r>
           </w:p>
           <w:p>
@@ -37118,7 +36120,7 @@
               <w:rPr>
                 <w:b/>
               </w:rPr>
-              <w:t xml:space="preserve">Women (n=220)</w:t>
+              <w:t>Women (n=220)</w:t>
             </w:r>
           </w:p>
         </w:tc>
@@ -37131,7 +36133,7 @@
               <w:rPr>
                 <w:b/>
               </w:rPr>
-              <w:t xml:space="preserve">Gender Harassment</w:t>
+              <w:t>Gender Harassment</w:t>
             </w:r>
           </w:p>
           <w:p>
@@ -37139,7 +36141,7 @@
               <w:rPr>
                 <w:b/>
               </w:rPr>
-              <w:t xml:space="preserve">Men (n=133)</w:t>
+              <w:t>Men (n=133)</w:t>
             </w:r>
           </w:p>
         </w:tc>
@@ -37152,7 +36154,7 @@
               <w:rPr>
                 <w:b/>
               </w:rPr>
-              <w:t xml:space="preserve">Gender Harassment</w:t>
+              <w:t>Gender Harassment</w:t>
             </w:r>
           </w:p>
           <w:p>
@@ -37160,7 +36162,7 @@
               <w:rPr>
                 <w:b/>
               </w:rPr>
-              <w:t xml:space="preserve">Women (n=220)</w:t>
+              <w:t>Women (n=220)</w:t>
             </w:r>
           </w:p>
         </w:tc>
@@ -37172,7 +36174,7 @@
           </w:tcPr>
           <w:p>
             <w:r>
-              <w:t xml:space="preserve">Age</w:t>
+              <w:t>Age</w:t>
             </w:r>
           </w:p>
         </w:tc>
@@ -37182,7 +36184,7 @@
           </w:tcPr>
           <w:p>
             <w:r>
-              <w:t xml:space="preserve">-0.069</w:t>
+              <w:t>-0.069</w:t>
             </w:r>
           </w:p>
         </w:tc>
@@ -37192,7 +36194,7 @@
           </w:tcPr>
           <w:p>
             <w:r>
-              <w:t xml:space="preserve">-0.057</w:t>
+              <w:t>-0.057</w:t>
             </w:r>
           </w:p>
         </w:tc>
@@ -37202,7 +36204,7 @@
           </w:tcPr>
           <w:p>
             <w:r>
-              <w:t xml:space="preserve">+0.010</w:t>
+              <w:t>+0.010</w:t>
             </w:r>
           </w:p>
         </w:tc>
@@ -37212,7 +36214,7 @@
           </w:tcPr>
           <w:p>
             <w:r>
-              <w:t xml:space="preserve">+0.158*</w:t>
+              <w:t>+0.158*</w:t>
             </w:r>
           </w:p>
         </w:tc>
@@ -37224,7 +36226,7 @@
           </w:tcPr>
           <w:p>
             <w:r>
-              <w:t xml:space="preserve">Area: Kinki vs Kanto</w:t>
+              <w:t>Area: Kinki vs Kanto</w:t>
             </w:r>
           </w:p>
         </w:tc>
@@ -37234,7 +36236,7 @@
           </w:tcPr>
           <w:p>
             <w:r>
-              <w:t xml:space="preserve">-0.304</w:t>
+              <w:t>-0.304</w:t>
             </w:r>
           </w:p>
         </w:tc>
@@ -37244,7 +36246,7 @@
           </w:tcPr>
           <w:p>
             <w:r>
-              <w:t xml:space="preserve">+0.108</w:t>
+              <w:t>+0.108</w:t>
             </w:r>
           </w:p>
         </w:tc>
@@ -37254,7 +36256,7 @@
           </w:tcPr>
           <w:p>
             <w:r>
-              <w:t xml:space="preserve">-0.013</w:t>
+              <w:t>-0.013</w:t>
             </w:r>
           </w:p>
         </w:tc>
@@ -37264,7 +36266,7 @@
           </w:tcPr>
           <w:p>
             <w:r>
-              <w:t xml:space="preserve">-0.030</w:t>
+              <w:t>-0.030</w:t>
             </w:r>
           </w:p>
         </w:tc>
@@ -37276,7 +36278,7 @@
           </w:tcPr>
           <w:p>
             <w:r>
-              <w:t xml:space="preserve">Area: Other vs Kanto</w:t>
+              <w:t>Area: Other vs Kanto</w:t>
             </w:r>
           </w:p>
         </w:tc>
@@ -37286,7 +36288,7 @@
           </w:tcPr>
           <w:p>
             <w:r>
-              <w:t xml:space="preserve">-0.015</w:t>
+              <w:t>-0.015</w:t>
             </w:r>
           </w:p>
         </w:tc>
@@ -37296,7 +36298,7 @@
           </w:tcPr>
           <w:p>
             <w:r>
-              <w:t xml:space="preserve">-0.008</w:t>
+              <w:t>-0.008</w:t>
             </w:r>
           </w:p>
         </w:tc>
@@ -37306,7 +36308,7 @@
           </w:tcPr>
           <w:p>
             <w:r>
-              <w:t xml:space="preserve">-0.244</w:t>
+              <w:t>-0.244</w:t>
             </w:r>
           </w:p>
         </w:tc>
@@ -37316,7 +36318,7 @@
           </w:tcPr>
           <w:p>
             <w:r>
-              <w:t xml:space="preserve">-0.144</w:t>
+              <w:t>-0.144</w:t>
             </w:r>
           </w:p>
         </w:tc>
@@ -37328,7 +36330,7 @@
           </w:tcPr>
           <w:p>
             <w:r>
-              <w:t xml:space="preserve">Machiavellianism</w:t>
+              <w:t>Machiavellianism</w:t>
             </w:r>
           </w:p>
         </w:tc>
@@ -37338,7 +36340,7 @@
           </w:tcPr>
           <w:p>
             <w:r>
-              <w:t xml:space="preserve">-0.172</w:t>
+              <w:t>-0.172</w:t>
             </w:r>
           </w:p>
         </w:tc>
@@ -37348,7 +36350,7 @@
           </w:tcPr>
           <w:p>
             <w:r>
-              <w:t xml:space="preserve">-0.076</w:t>
+              <w:t>-0.076</w:t>
             </w:r>
           </w:p>
         </w:tc>
@@ -37358,7 +36360,7 @@
           </w:tcPr>
           <w:p>
             <w:r>
-              <w:t xml:space="preserve">-0.109</w:t>
+              <w:t>-0.109</w:t>
             </w:r>
           </w:p>
         </w:tc>
@@ -37368,7 +36370,7 @@
           </w:tcPr>
           <w:p>
             <w:r>
-              <w:t xml:space="preserve">-0.213**</w:t>
+              <w:t>-0.213**</w:t>
             </w:r>
           </w:p>
         </w:tc>
@@ -37380,7 +36382,7 @@
           </w:tcPr>
           <w:p>
             <w:r>
-              <w:t xml:space="preserve">Narcissism</w:t>
+              <w:t>Narcissism</w:t>
             </w:r>
           </w:p>
         </w:tc>
@@ -37390,7 +36392,7 @@
           </w:tcPr>
           <w:p>
             <w:r>
-              <w:t xml:space="preserve">+0.224</w:t>
+              <w:t>+0.224</w:t>
             </w:r>
           </w:p>
         </w:tc>
@@ -37400,7 +36402,7 @@
           </w:tcPr>
           <w:p>
             <w:r>
-              <w:t xml:space="preserve">-0.085</w:t>
+              <w:t>-0.085</w:t>
             </w:r>
           </w:p>
         </w:tc>
@@ -37410,7 +36412,7 @@
           </w:tcPr>
           <w:p>
             <w:r>
-              <w:t xml:space="preserve">+0.224</w:t>
+              <w:t>+0.224</w:t>
             </w:r>
           </w:p>
         </w:tc>
@@ -37420,7 +36422,7 @@
           </w:tcPr>
           <w:p>
             <w:r>
-              <w:t xml:space="preserve">+0.159†</w:t>
+              <w:t>+0.159†</w:t>
             </w:r>
           </w:p>
         </w:tc>
@@ -37432,7 +36434,7 @@
           </w:tcPr>
           <w:p>
             <w:r>
-              <w:t xml:space="preserve">Psychopathy</w:t>
+              <w:t>Psychopathy</w:t>
             </w:r>
           </w:p>
         </w:tc>
@@ -37442,7 +36444,7 @@
           </w:tcPr>
           <w:p>
             <w:r>
-              <w:t xml:space="preserve">+0.447***</w:t>
+              <w:t>+0.447***</w:t>
             </w:r>
           </w:p>
         </w:tc>
@@ -37452,7 +36454,7 @@
           </w:tcPr>
           <w:p>
             <w:r>
-              <w:t xml:space="preserve">+0.237**</w:t>
+              <w:t>+0.237**</w:t>
             </w:r>
           </w:p>
         </w:tc>
@@ -37462,7 +36464,7 @@
           </w:tcPr>
           <w:p>
             <w:r>
-              <w:t xml:space="preserve">+0.217*</w:t>
+              <w:t>+0.217*</w:t>
             </w:r>
           </w:p>
         </w:tc>
@@ -37472,7 +36474,7 @@
           </w:tcPr>
           <w:p>
             <w:r>
-              <w:t xml:space="preserve">+0.120†</w:t>
+              <w:t>+0.120†</w:t>
             </w:r>
           </w:p>
         </w:tc>
@@ -37484,7 +36486,7 @@
           </w:tcPr>
           <w:p>
             <w:r>
-              <w:t xml:space="preserve">Honesty–Humility</w:t>
+              <w:t>Honesty–Humility</w:t>
             </w:r>
           </w:p>
         </w:tc>
@@ -37494,7 +36496,7 @@
           </w:tcPr>
           <w:p>
             <w:r>
-              <w:t xml:space="preserve">-0.010</w:t>
+              <w:t>-0.010</w:t>
             </w:r>
           </w:p>
         </w:tc>
@@ -37504,7 +36506,7 @@
           </w:tcPr>
           <w:p>
             <w:r>
-              <w:t xml:space="preserve">-0.191*</w:t>
+              <w:t>-0.191*</w:t>
             </w:r>
           </w:p>
         </w:tc>
@@ -37514,7 +36516,7 @@
           </w:tcPr>
           <w:p>
             <w:r>
-              <w:t xml:space="preserve">-0.131</w:t>
+              <w:t>-0.131</w:t>
             </w:r>
           </w:p>
         </w:tc>
@@ -37524,7 +36526,7 @@
           </w:tcPr>
           <w:p>
             <w:r>
-              <w:t xml:space="preserve">-0.274**</w:t>
+              <w:t>-0.274**</w:t>
             </w:r>
           </w:p>
         </w:tc>
@@ -37536,7 +36538,7 @@
           </w:tcPr>
           <w:p>
             <w:r>
-              <w:t xml:space="preserve">Emotionality</w:t>
+              <w:t>Emotionality</w:t>
             </w:r>
           </w:p>
         </w:tc>
@@ -37546,7 +36548,7 @@
           </w:tcPr>
           <w:p>
             <w:r>
-              <w:t xml:space="preserve">+0.060</w:t>
+              <w:t>+0.060</w:t>
             </w:r>
           </w:p>
         </w:tc>
@@ -37556,7 +36558,7 @@
           </w:tcPr>
           <w:p>
             <w:r>
-              <w:t xml:space="preserve">-0.069</w:t>
+              <w:t>-0.069</w:t>
             </w:r>
           </w:p>
         </w:tc>
@@ -37566,7 +36568,7 @@
           </w:tcPr>
           <w:p>
             <w:r>
-              <w:t xml:space="preserve">-0.032</w:t>
+              <w:t>-0.032</w:t>
             </w:r>
           </w:p>
         </w:tc>
@@ -37576,7 +36578,7 @@
           </w:tcPr>
           <w:p>
             <w:r>
-              <w:t xml:space="preserve">+0.080</w:t>
+              <w:t>+0.080</w:t>
             </w:r>
           </w:p>
         </w:tc>
@@ -37588,7 +36590,7 @@
           </w:tcPr>
           <w:p>
             <w:r>
-              <w:t xml:space="preserve">Extraversion</w:t>
+              <w:t>Extraversion</w:t>
             </w:r>
           </w:p>
         </w:tc>
@@ -37598,7 +36600,7 @@
           </w:tcPr>
           <w:p>
             <w:r>
-              <w:t xml:space="preserve">-0.106</w:t>
+              <w:t>-0.106</w:t>
             </w:r>
           </w:p>
         </w:tc>
@@ -37608,7 +36610,7 @@
           </w:tcPr>
           <w:p>
             <w:r>
-              <w:t xml:space="preserve">-0.012</w:t>
+              <w:t>-0.012</w:t>
             </w:r>
           </w:p>
         </w:tc>
@@ -37618,7 +36620,7 @@
           </w:tcPr>
           <w:p>
             <w:r>
-              <w:t xml:space="preserve">+0.077</w:t>
+              <w:t>+0.077</w:t>
             </w:r>
           </w:p>
         </w:tc>
@@ -37628,7 +36630,7 @@
           </w:tcPr>
           <w:p>
             <w:r>
-              <w:t xml:space="preserve">-0.071</w:t>
+              <w:t>-0.071</w:t>
             </w:r>
           </w:p>
         </w:tc>
@@ -37640,7 +36642,7 @@
           </w:tcPr>
           <w:p>
             <w:r>
-              <w:t xml:space="preserve">Agreeableness</w:t>
+              <w:t>Agreeableness</w:t>
             </w:r>
           </w:p>
         </w:tc>
@@ -37650,7 +36652,7 @@
           </w:tcPr>
           <w:p>
             <w:r>
-              <w:t xml:space="preserve">-0.019</w:t>
+              <w:t>-0.019</w:t>
             </w:r>
           </w:p>
         </w:tc>
@@ -37660,7 +36662,7 @@
           </w:tcPr>
           <w:p>
             <w:r>
-              <w:t xml:space="preserve">-0.174*</w:t>
+              <w:t>-0.174*</w:t>
             </w:r>
           </w:p>
         </w:tc>
@@ -37670,7 +36672,7 @@
           </w:tcPr>
           <w:p>
             <w:r>
-              <w:t xml:space="preserve">+0.087</w:t>
+              <w:t>+0.087</w:t>
             </w:r>
           </w:p>
         </w:tc>
@@ -37680,7 +36682,7 @@
           </w:tcPr>
           <w:p>
             <w:r>
-              <w:t xml:space="preserve">+0.081</w:t>
+              <w:t>+0.081</w:t>
             </w:r>
           </w:p>
         </w:tc>
@@ -37692,7 +36694,7 @@
           </w:tcPr>
           <w:p>
             <w:r>
-              <w:t xml:space="preserve">Conscientiousness</w:t>
+              <w:t>Conscientiousness</w:t>
             </w:r>
           </w:p>
         </w:tc>
@@ -37702,7 +36704,7 @@
           </w:tcPr>
           <w:p>
             <w:r>
-              <w:t xml:space="preserve">-0.001</w:t>
+              <w:t>-0.001</w:t>
             </w:r>
           </w:p>
         </w:tc>
@@ -37712,7 +36714,7 @@
           </w:tcPr>
           <w:p>
             <w:r>
-              <w:t xml:space="preserve">-0.068</w:t>
+              <w:t>-0.068</w:t>
             </w:r>
           </w:p>
         </w:tc>
@@ -37722,7 +36724,7 @@
           </w:tcPr>
           <w:p>
             <w:r>
-              <w:t xml:space="preserve">+0.083</w:t>
+              <w:t>+0.083</w:t>
             </w:r>
           </w:p>
         </w:tc>
@@ -37732,7 +36734,7 @@
           </w:tcPr>
           <w:p>
             <w:r>
-              <w:t xml:space="preserve">+0.007</w:t>
+              <w:t>+0.007</w:t>
             </w:r>
           </w:p>
         </w:tc>
@@ -37744,7 +36746,7 @@
           </w:tcPr>
           <w:p>
             <w:r>
-              <w:t xml:space="preserve">Openness</w:t>
+              <w:t>Openness</w:t>
             </w:r>
           </w:p>
         </w:tc>
@@ -37754,7 +36756,7 @@
           </w:tcPr>
           <w:p>
             <w:r>
-              <w:t xml:space="preserve">-0.119</w:t>
+              <w:t>-0.119</w:t>
             </w:r>
           </w:p>
         </w:tc>
@@ -37764,7 +36766,7 @@
           </w:tcPr>
           <w:p>
             <w:r>
-              <w:t xml:space="preserve">+0.100</w:t>
+              <w:t>+0.100</w:t>
             </w:r>
           </w:p>
         </w:tc>
@@ -37774,7 +36776,7 @@
           </w:tcPr>
           <w:p>
             <w:r>
-              <w:t xml:space="preserve">-0.442***</w:t>
+              <w:t>-0.442***</w:t>
             </w:r>
           </w:p>
         </w:tc>
@@ -37784,7 +36786,7 @@
           </w:tcPr>
           <w:p>
             <w:r>
-              <w:t xml:space="preserve">-0.125†</w:t>
+              <w:t>-0.125†</w:t>
             </w:r>
           </w:p>
         </w:tc>
@@ -37792,7 +36794,7 @@
     </w:tbl>
     <w:p>
       <w:r>
-        <w:t xml:space="preserve">Note. Each column reports HC3-robust standardized β coefficients from a sex-stratified Model B (controls + Dark Triad + HEXACO) estimated separately for men (gender = 0) and women (gender = 1). Significance markers: † p &lt; .10; * p &lt; .05; ** p &lt; .01; *** p &lt; .001. The "Gender (1 = female)" predictor is not estimated within sex-stratified models. Formal tests of cross-sex equality of regression coefficients (e.g., multi-group SEM) are not estimated here; the divergence in male versus female estimates should be read as a hypothesis-generating pattern, not as a confirmed moderation effect.</w:t>
+        <w:t>Note. Each column reports HC3-robust standardized β coefficients from a sex-stratified Model B (controls + Dark Triad + HEXACO) estimated separately for men (gender = 0) and women (gender = 1). Significance markers: † p &lt; .10; * p &lt; .05; ** p &lt; .01; *** p &lt; .001. The "Gender (1 = female)" predictor is not estimated within sex-stratified models. Formal tests of cross-sex equality of regression coefficients (e.g., multi-group SEM) are not estimated here; the divergence in male versus female estimates should be read as a hypothesis-generating pattern, not as a confirmed moderation effect.</w:t>
       </w:r>
     </w:p>
     <w:sectPr>
@@ -37849,7 +36851,7 @@
 <w:hdr xmlns:wpc="http://schemas.microsoft.com/office/word/2010/wordprocessingCanvas" xmlns:cx="http://schemas.microsoft.com/office/drawing/2014/chartex" xmlns:cx1="http://schemas.microsoft.com/office/drawing/2015/9/8/chartex" xmlns:cx2="http://schemas.microsoft.com/office/drawing/2015/10/21/chartex" xmlns:cx3="http://schemas.microsoft.com/office/drawing/2016/5/9/chartex" xmlns:cx4="http://schemas.microsoft.com/office/drawing/2016/5/10/chartex" xmlns:cx5="http://schemas.microsoft.com/office/drawing/2016/5/11/chartex" xmlns:cx6="http://schemas.microsoft.com/office/drawing/2016/5/12/chartex" xmlns:cx7="http://schemas.microsoft.com/office/drawing/2016/5/13/chartex" xmlns:cx8="http://schemas.microsoft.com/office/drawing/2016/5/14/chartex" xmlns:mc="http://schemas.openxmlformats.org/markup-compatibility/2006" xmlns:aink="http://schemas.microsoft.com/office/drawing/2016/ink" xmlns:am3d="http://schemas.microsoft.com/office/drawing/2017/model3d" xmlns:o="urn:schemas-microsoft-com:office:office" xmlns:oel="http://schemas.microsoft.com/office/2019/extlst" xmlns:r="http://schemas.openxmlformats.org/officeDocument/2006/relationships" xmlns:m="http://schemas.openxmlformats.org/officeDocument/2006/math" xmlns:v="urn:schemas-microsoft-com:vml" xmlns:wp14="http://schemas.microsoft.com/office/word/2010/wordprocessingDrawing" xmlns:wp="http://schemas.openxmlformats.org/drawingml/2006/wordprocessingDrawing" xmlns:w10="urn:schemas-microsoft-com:office:word" xmlns:w="http://schemas.openxmlformats.org/wordprocessingml/2006/main" xmlns:w14="http://schemas.microsoft.com/office/word/2010/wordml" xmlns:w15="http://schemas.microsoft.com/office/word/2012/wordml" xmlns:w16cex="http://schemas.microsoft.com/office/word/2018/wordml/cex" xmlns:w16cid="http://schemas.microsoft.com/office/word/2016/wordml/cid" xmlns:w16="http://schemas.microsoft.com/office/word/2018/wordml" xmlns:w16du="http://schemas.microsoft.com/office/word/2023/wordml/word16du" xmlns:w16sdtdh="http://schemas.microsoft.com/office/word/2020/wordml/sdtdatahash" xmlns:w16sdtfl="http://schemas.microsoft.com/office/word/2024/wordml/sdtformatlock" xmlns:w16se="http://schemas.microsoft.com/office/word/2015/wordml/symex" xmlns:wpg="http://schemas.microsoft.com/office/word/2010/wordprocessingGroup" xmlns:wpi="http://schemas.microsoft.com/office/word/2010/wordprocessingInk" xmlns:wne="http://schemas.microsoft.com/office/word/2006/wordml" xmlns:wps="http://schemas.microsoft.com/office/word/2010/wordprocessingShape" mc:Ignorable="w14 w15 w16se w16cid w16 w16cex w16sdtdh w16sdtfl w16du wp14">
   <w:p>
     <w:pPr>
-      <w:pStyle w:val="af"/>
+      <w:pStyle w:val="a7"/>
       <w:jc w:val="right"/>
     </w:pPr>
     <w:r>
@@ -38848,7 +37850,8 @@
       <w:szCs w:val="30"/>
     </w:rPr>
   </w:style>
-  <w:style w:type="table" w:customStyle="1" w:styleId="a7">
+  <w:style w:type="table" w:customStyle="1" w:styleId="8">
+    <w:name w:val="8"/>
     <w:basedOn w:val="TableNormal"/>
     <w:tblPr>
       <w:tblStyleRowBandSize w:val="1"/>
@@ -38861,7 +37864,8 @@
       </w:tblCellMar>
     </w:tblPr>
   </w:style>
-  <w:style w:type="table" w:customStyle="1" w:styleId="a8">
+  <w:style w:type="table" w:customStyle="1" w:styleId="7">
+    <w:name w:val="7"/>
     <w:basedOn w:val="TableNormal"/>
     <w:tblPr>
       <w:tblStyleRowBandSize w:val="1"/>
@@ -38874,7 +37878,8 @@
       </w:tblCellMar>
     </w:tblPr>
   </w:style>
-  <w:style w:type="table" w:customStyle="1" w:styleId="a9">
+  <w:style w:type="table" w:customStyle="1" w:styleId="61">
+    <w:name w:val="6"/>
     <w:basedOn w:val="TableNormal"/>
     <w:tblPr>
       <w:tblStyleRowBandSize w:val="1"/>
@@ -38887,7 +37892,8 @@
       </w:tblCellMar>
     </w:tblPr>
   </w:style>
-  <w:style w:type="table" w:customStyle="1" w:styleId="aa">
+  <w:style w:type="table" w:customStyle="1" w:styleId="51">
+    <w:name w:val="5"/>
     <w:basedOn w:val="TableNormal"/>
     <w:tblPr>
       <w:tblStyleRowBandSize w:val="1"/>
@@ -38900,7 +37906,8 @@
       </w:tblCellMar>
     </w:tblPr>
   </w:style>
-  <w:style w:type="table" w:customStyle="1" w:styleId="ab">
+  <w:style w:type="table" w:customStyle="1" w:styleId="41">
+    <w:name w:val="4"/>
     <w:basedOn w:val="TableNormal"/>
     <w:tblPr>
       <w:tblStyleRowBandSize w:val="1"/>
@@ -38913,7 +37920,8 @@
       </w:tblCellMar>
     </w:tblPr>
   </w:style>
-  <w:style w:type="table" w:customStyle="1" w:styleId="ac">
+  <w:style w:type="table" w:customStyle="1" w:styleId="31">
+    <w:name w:val="3"/>
     <w:basedOn w:val="TableNormal"/>
     <w:tblPr>
       <w:tblStyleRowBandSize w:val="1"/>
@@ -38926,7 +37934,8 @@
       </w:tblCellMar>
     </w:tblPr>
   </w:style>
-  <w:style w:type="table" w:customStyle="1" w:styleId="ad">
+  <w:style w:type="table" w:customStyle="1" w:styleId="21">
+    <w:name w:val="2"/>
     <w:basedOn w:val="TableNormal"/>
     <w:tblPr>
       <w:tblStyleRowBandSize w:val="1"/>
@@ -38939,7 +37948,8 @@
       </w:tblCellMar>
     </w:tblPr>
   </w:style>
-  <w:style w:type="table" w:customStyle="1" w:styleId="ae">
+  <w:style w:type="table" w:customStyle="1" w:styleId="11">
+    <w:name w:val="1"/>
     <w:basedOn w:val="TableNormal"/>
     <w:tblPr>
       <w:tblStyleRowBandSize w:val="1"/>
@@ -38952,10 +37962,10 @@
       </w:tblCellMar>
     </w:tblPr>
   </w:style>
-  <w:style w:type="paragraph" w:styleId="af">
+  <w:style w:type="paragraph" w:styleId="a7">
     <w:name w:val="header"/>
     <w:basedOn w:val="a"/>
-    <w:link w:val="af0"/>
+    <w:link w:val="a8"/>
     <w:uiPriority w:val="99"/>
     <w:unhideWhenUsed/>
     <w:rsid w:val="00F263D9"/>
@@ -38967,17 +37977,17 @@
       <w:snapToGrid w:val="0"/>
     </w:pPr>
   </w:style>
-  <w:style w:type="character" w:customStyle="1" w:styleId="af0">
+  <w:style w:type="character" w:customStyle="1" w:styleId="a8">
     <w:name w:val="ヘッダー (文字)"/>
     <w:basedOn w:val="a0"/>
-    <w:link w:val="af"/>
+    <w:link w:val="a7"/>
     <w:uiPriority w:val="99"/>
     <w:rsid w:val="00F263D9"/>
   </w:style>
-  <w:style w:type="paragraph" w:styleId="af1">
+  <w:style w:type="paragraph" w:styleId="a9">
     <w:name w:val="footer"/>
     <w:basedOn w:val="a"/>
-    <w:link w:val="af2"/>
+    <w:link w:val="aa"/>
     <w:uiPriority w:val="99"/>
     <w:unhideWhenUsed/>
     <w:rsid w:val="00F263D9"/>
@@ -38989,14 +37999,14 @@
       <w:snapToGrid w:val="0"/>
     </w:pPr>
   </w:style>
-  <w:style w:type="character" w:customStyle="1" w:styleId="af2">
+  <w:style w:type="character" w:customStyle="1" w:styleId="aa">
     <w:name w:val="フッター (文字)"/>
     <w:basedOn w:val="a0"/>
-    <w:link w:val="af1"/>
+    <w:link w:val="a9"/>
     <w:uiPriority w:val="99"/>
     <w:rsid w:val="00F263D9"/>
   </w:style>
-  <w:style w:type="character" w:styleId="af3">
+  <w:style w:type="character" w:styleId="ab">
     <w:name w:val="Hyperlink"/>
     <w:basedOn w:val="a0"/>
     <w:uiPriority w:val="99"/>
@@ -39007,7 +38017,7 @@
       <w:u w:val="single"/>
     </w:rPr>
   </w:style>
-  <w:style w:type="character" w:styleId="af4">
+  <w:style w:type="character" w:styleId="ac">
     <w:name w:val="Unresolved Mention"/>
     <w:basedOn w:val="a0"/>
     <w:uiPriority w:val="99"/>
@@ -39019,7 +38029,7 @@
       <w:shd w:val="clear" w:color="auto" w:fill="E1DFDD"/>
     </w:rPr>
   </w:style>
-  <w:style w:type="numbering" w:customStyle="1" w:styleId="11">
+  <w:style w:type="numbering" w:customStyle="1" w:styleId="12">
     <w:name w:val="リストなし1"/>
     <w:next w:val="a2"/>
     <w:uiPriority w:val="99"/>
@@ -39138,7 +38148,7 @@
       <w:szCs w:val="30"/>
     </w:rPr>
   </w:style>
-  <w:style w:type="paragraph" w:styleId="af5">
+  <w:style w:type="paragraph" w:styleId="ad">
     <w:name w:val="Revision"/>
     <w:hidden/>
     <w:uiPriority w:val="99"/>
@@ -39148,7 +38158,7 @@
       <w:spacing w:line="240" w:lineRule="auto"/>
     </w:pPr>
   </w:style>
-  <w:style w:type="character" w:styleId="af6">
+  <w:style w:type="character" w:styleId="ae">
     <w:name w:val="line number"/>
     <w:basedOn w:val="a0"/>
     <w:uiPriority w:val="99"/>
@@ -39161,7 +38171,7 @@
       <w:szCs w:val="24"/>
     </w:rPr>
   </w:style>
-  <w:style w:type="character" w:styleId="af7">
+  <w:style w:type="character" w:styleId="af">
     <w:name w:val="annotation reference"/>
     <w:basedOn w:val="a0"/>
     <w:uiPriority w:val="99"/>
@@ -39173,10 +38183,10 @@
       <w:szCs w:val="18"/>
     </w:rPr>
   </w:style>
-  <w:style w:type="paragraph" w:styleId="af8">
+  <w:style w:type="paragraph" w:styleId="af0">
     <w:name w:val="annotation text"/>
     <w:basedOn w:val="a"/>
-    <w:link w:val="af9"/>
+    <w:link w:val="af1"/>
     <w:uiPriority w:val="99"/>
     <w:unhideWhenUsed/>
     <w:rsid w:val="006F1C8E"/>
@@ -39184,10 +38194,10 @@
       <w:jc w:val="left"/>
     </w:pPr>
   </w:style>
-  <w:style w:type="character" w:customStyle="1" w:styleId="af9">
+  <w:style w:type="character" w:customStyle="1" w:styleId="af1">
     <w:name w:val="コメント文字列 (文字)"/>
     <w:basedOn w:val="a0"/>
-    <w:link w:val="af8"/>
+    <w:link w:val="af0"/>
     <w:uiPriority w:val="99"/>
     <w:rsid w:val="006F1C8E"/>
     <w:rPr>
@@ -39196,11 +38206,11 @@
       <w:szCs w:val="24"/>
     </w:rPr>
   </w:style>
-  <w:style w:type="paragraph" w:styleId="afa">
+  <w:style w:type="paragraph" w:styleId="af2">
     <w:name w:val="annotation subject"/>
-    <w:basedOn w:val="af8"/>
-    <w:next w:val="af8"/>
-    <w:link w:val="afb"/>
+    <w:basedOn w:val="af0"/>
+    <w:next w:val="af0"/>
+    <w:link w:val="af3"/>
     <w:uiPriority w:val="99"/>
     <w:semiHidden/>
     <w:unhideWhenUsed/>
@@ -39210,10 +38220,10 @@
       <w:bCs/>
     </w:rPr>
   </w:style>
-  <w:style w:type="character" w:customStyle="1" w:styleId="afb">
+  <w:style w:type="character" w:customStyle="1" w:styleId="af3">
     <w:name w:val="コメント内容 (文字)"/>
-    <w:basedOn w:val="af9"/>
-    <w:link w:val="afa"/>
+    <w:basedOn w:val="af1"/>
+    <w:link w:val="af2"/>
     <w:uiPriority w:val="99"/>
     <w:semiHidden/>
     <w:rsid w:val="006F1C8E"/>
@@ -39225,7 +38235,7 @@
       <w:szCs w:val="24"/>
     </w:rPr>
   </w:style>
-  <w:style w:type="paragraph" w:styleId="afc">
+  <w:style w:type="paragraph" w:styleId="af4">
     <w:name w:val="List Paragraph"/>
     <w:basedOn w:val="a"/>
     <w:uiPriority w:val="34"/>

</xml_diff>